<commit_message>
Noted that images may be transferred over HTTP, MQTT, TCP/IP, in addition to FTP. Minor changes made for clarity/correctness
</commit_message>
<xml_diff>
--- a/projects/Camera485/Camera485 Application Note.docx
+++ b/projects/Camera485/Camera485 Application Note.docx
@@ -1,69 +1,37 @@
 
 <file path=word/document.xml><?xml version="1.0" encoding="utf-8"?>
-<w:document xmlns:wpc="http://schemas.microsoft.com/office/word/2010/wordprocessingCanvas" xmlns:cx="http://schemas.microsoft.com/office/drawing/2014/chartex" xmlns:cx1="http://schemas.microsoft.com/office/drawing/2015/9/8/chartex" xmlns:cx2="http://schemas.microsoft.com/office/drawing/2015/10/21/chartex" xmlns:cx3="http://schemas.microsoft.com/office/drawing/2016/5/9/chartex" xmlns:cx4="http://schemas.microsoft.com/office/drawing/2016/5/10/chartex" xmlns:cx5="http://schemas.microsoft.com/office/drawing/2016/5/11/chartex" xmlns:cx6="http://schemas.microsoft.com/office/drawing/2016/5/12/chartex" xmlns:cx7="http://schemas.microsoft.com/office/drawing/2016/5/13/chartex" xmlns:cx8="http://schemas.microsoft.com/office/drawing/2016/5/14/chartex" xmlns:mc="http://schemas.openxmlformats.org/markup-compatibility/2006" xmlns:aink="http://schemas.microsoft.com/office/drawing/2016/ink" xmlns:am3d="http://schemas.microsoft.com/office/drawing/2017/model3d" xmlns:o="urn:schemas-microsoft-com:office:office" xmlns:r="http://schemas.openxmlformats.org/officeDocument/2006/relationships" xmlns:m="http://schemas.openxmlformats.org/officeDocument/2006/math" xmlns:v="urn:schemas-microsoft-com:vml" xmlns:wp14="http://schemas.microsoft.com/office/word/2010/wordprocessingDrawing" xmlns:wp="http://schemas.openxmlformats.org/drawingml/2006/wordprocessingDrawing" xmlns:w10="urn:schemas-microsoft-com:office:word" xmlns:w="http://schemas.openxmlformats.org/wordprocessingml/2006/main" xmlns:w14="http://schemas.microsoft.com/office/word/2010/wordml" xmlns:w15="http://schemas.microsoft.com/office/word/2012/wordml" xmlns:w16cex="http://schemas.microsoft.com/office/word/2018/wordml/cex" xmlns:w16cid="http://schemas.microsoft.com/office/word/2016/wordml/cid" xmlns:w16="http://schemas.microsoft.com/office/word/2018/wordml" xmlns:w16se="http://schemas.microsoft.com/office/word/2015/wordml/symex" xmlns:wpg="http://schemas.microsoft.com/office/word/2010/wordprocessingGroup" xmlns:wpi="http://schemas.microsoft.com/office/word/2010/wordprocessingInk" xmlns:wne="http://schemas.microsoft.com/office/word/2006/wordml" xmlns:wps="http://schemas.microsoft.com/office/word/2010/wordprocessingShape" mc:Ignorable="w14 w15 w16se w16cid w16 w16cex wp14">
+<w:document xmlns:wpc="http://schemas.microsoft.com/office/word/2010/wordprocessingCanvas" xmlns:cx="http://schemas.microsoft.com/office/drawing/2014/chartex" xmlns:cx1="http://schemas.microsoft.com/office/drawing/2015/9/8/chartex" xmlns:cx2="http://schemas.microsoft.com/office/drawing/2015/10/21/chartex" xmlns:cx3="http://schemas.microsoft.com/office/drawing/2016/5/9/chartex" xmlns:cx4="http://schemas.microsoft.com/office/drawing/2016/5/10/chartex" xmlns:cx5="http://schemas.microsoft.com/office/drawing/2016/5/11/chartex" xmlns:cx6="http://schemas.microsoft.com/office/drawing/2016/5/12/chartex" xmlns:cx7="http://schemas.microsoft.com/office/drawing/2016/5/13/chartex" xmlns:cx8="http://schemas.microsoft.com/office/drawing/2016/5/14/chartex" xmlns:mc="http://schemas.openxmlformats.org/markup-compatibility/2006" xmlns:aink="http://schemas.microsoft.com/office/drawing/2016/ink" xmlns:am3d="http://schemas.microsoft.com/office/drawing/2017/model3d" xmlns:o="urn:schemas-microsoft-com:office:office" xmlns:oel="http://schemas.microsoft.com/office/2019/extlst" xmlns:r="http://schemas.openxmlformats.org/officeDocument/2006/relationships" xmlns:m="http://schemas.openxmlformats.org/officeDocument/2006/math" xmlns:v="urn:schemas-microsoft-com:vml" xmlns:wp14="http://schemas.microsoft.com/office/word/2010/wordprocessingDrawing" xmlns:wp="http://schemas.openxmlformats.org/drawingml/2006/wordprocessingDrawing" xmlns:w10="urn:schemas-microsoft-com:office:word" xmlns:w="http://schemas.openxmlformats.org/wordprocessingml/2006/main" xmlns:w14="http://schemas.microsoft.com/office/word/2010/wordml" xmlns:w15="http://schemas.microsoft.com/office/word/2012/wordml" xmlns:w16cex="http://schemas.microsoft.com/office/word/2018/wordml/cex" xmlns:w16cid="http://schemas.microsoft.com/office/word/2016/wordml/cid" xmlns:w16="http://schemas.microsoft.com/office/word/2018/wordml" xmlns:w16du="http://schemas.microsoft.com/office/word/2023/wordml/word16du" xmlns:w16sdtdh="http://schemas.microsoft.com/office/word/2020/wordml/sdtdatahash" xmlns:w16sdtfl="http://schemas.microsoft.com/office/word/2024/wordml/sdtformatlock" xmlns:w16se="http://schemas.microsoft.com/office/word/2015/wordml/symex" xmlns:wpg="http://schemas.microsoft.com/office/word/2010/wordprocessingGroup" xmlns:wpi="http://schemas.microsoft.com/office/word/2010/wordprocessingInk" xmlns:wne="http://schemas.microsoft.com/office/word/2006/wordml" xmlns:wps="http://schemas.microsoft.com/office/word/2010/wordprocessingShape" mc:Ignorable="w14 w15 w16se w16cid w16 w16cex w16sdtdh w16sdtfl w16du wp14">
   <w:body>
     <w:p>
       <w:pPr>
-        <w:pStyle w:val="Heading5"/>
-        <w:rPr>
-          <w:color w:val="3B3838" w:themeColor="background2" w:themeShade="40"/>
-        </w:rPr>
-      </w:pPr>
-    </w:p>
-    <w:p>
-      <w:pPr>
-        <w:pStyle w:val="Heading5"/>
-        <w:rPr>
-          <w:color w:val="3B3838" w:themeColor="background2" w:themeShade="40"/>
-        </w:rPr>
-      </w:pPr>
-    </w:p>
-    <w:p>
-      <w:pPr>
-        <w:pStyle w:val="Heading5"/>
-        <w:rPr>
-          <w:color w:val="3B3838" w:themeColor="background2" w:themeShade="40"/>
-        </w:rPr>
-      </w:pPr>
-      <w:r>
-        <w:rPr>
-          <w:color w:val="3B3838" w:themeColor="background2" w:themeShade="40"/>
-        </w:rPr>
-        <w:t>Using Camera485 with the XLink-500</w:t>
-      </w:r>
-    </w:p>
-    <w:p>
-      <w:pPr>
-        <w:rPr>
-          <w:lang w:val="en-US"/>
-        </w:rPr>
-      </w:pPr>
-    </w:p>
-    <w:p>
-      <w:pPr>
-        <w:rPr>
-          <w:lang w:val="en-US"/>
-        </w:rPr>
-      </w:pPr>
-    </w:p>
-    <w:p>
-      <w:pPr>
-        <w:rPr>
-          <w:lang w:val="en-US"/>
-        </w:rPr>
-      </w:pPr>
-    </w:p>
+        <w:pStyle w:val="Title"/>
+      </w:pPr>
+      <w:r>
+        <w:t xml:space="preserve">Using Camera485 with </w:t>
+      </w:r>
+      <w:r>
+        <w:t xml:space="preserve">Sutron </w:t>
+      </w:r>
+      <w:r>
+        <w:t>XLink</w:t>
+      </w:r>
+      <w:r>
+        <w:t xml:space="preserve"> </w:t>
+      </w:r>
+      <w:r>
+        <w:t>500</w:t>
+      </w:r>
+    </w:p>
+    <w:p/>
+    <w:p/>
+    <w:p/>
+    <w:p/>
+    <w:p/>
     <w:p>
       <w:pPr>
         <w:jc w:val="center"/>
-        <w:rPr>
-          <w:lang w:val="en-US"/>
-        </w:rPr>
-      </w:pPr>
-      <w:r>
-        <w:rPr>
-          <w:noProof/>
-        </w:rPr>
+      </w:pPr>
+      <w:r>
         <w:drawing>
           <wp:inline distT="0" distB="0" distL="0" distR="0" wp14:anchorId="5EA9A03D" wp14:editId="2C751C0D">
             <wp:extent cx="1836807" cy="2219325"/>
@@ -101,9 +69,6 @@
         </w:drawing>
       </w:r>
       <w:r>
-        <w:rPr>
-          <w:noProof/>
-        </w:rPr>
         <w:drawing>
           <wp:inline distT="0" distB="0" distL="0" distR="0" wp14:anchorId="6375D0E7" wp14:editId="39DC1DDD">
             <wp:extent cx="2085975" cy="1484251"/>
@@ -141,34 +106,15 @@
         </w:drawing>
       </w:r>
     </w:p>
-    <w:p>
-      <w:pPr>
-        <w:rPr>
-          <w:lang w:val="en-US"/>
-        </w:rPr>
-      </w:pPr>
-    </w:p>
-    <w:p>
-      <w:pPr>
-        <w:rPr>
-          <w:lang w:val="en-US"/>
-        </w:rPr>
-      </w:pPr>
-    </w:p>
-    <w:p>
-      <w:pPr>
-        <w:rPr>
-          <w:lang w:val="en-US"/>
-        </w:rPr>
-      </w:pPr>
-    </w:p>
+    <w:p/>
+    <w:p/>
+    <w:p/>
     <w:p>
       <w:pPr>
         <w:jc w:val="center"/>
         <w:rPr>
           <w:b/>
           <w:bCs/>
-          <w:lang w:val="en-US"/>
         </w:rPr>
       </w:pPr>
     </w:p>
@@ -180,7 +126,6 @@
           <w:bCs/>
           <w:sz w:val="28"/>
           <w:szCs w:val="28"/>
-          <w:lang w:val="en-US"/>
         </w:rPr>
       </w:pPr>
       <w:r>
@@ -189,39 +134,44 @@
           <w:bCs/>
           <w:sz w:val="28"/>
           <w:szCs w:val="28"/>
-          <w:lang w:val="en-US"/>
         </w:rPr>
-        <w:t>May 2021</w:t>
-      </w:r>
-    </w:p>
-    <w:p>
-      <w:pPr>
-        <w:jc w:val="center"/>
-        <w:rPr>
-          <w:b/>
-          <w:bCs/>
-          <w:lang w:val="en-US"/>
-        </w:rPr>
-      </w:pPr>
+        <w:t xml:space="preserve">May </w:t>
+      </w:r>
       <w:r>
         <w:rPr>
           <w:b/>
           <w:bCs/>
           <w:sz w:val="28"/>
           <w:szCs w:val="28"/>
-          <w:lang w:val="en-US"/>
         </w:rPr>
-        <w:t>Version 2.</w:t>
-      </w:r>
+        <w:t>2026</w:t>
+      </w:r>
+    </w:p>
+    <w:p>
+      <w:pPr>
+        <w:jc w:val="center"/>
+        <w:rPr>
+          <w:b/>
+          <w:bCs/>
+        </w:rPr>
+      </w:pPr>
       <w:r>
         <w:rPr>
           <w:b/>
           <w:bCs/>
           <w:sz w:val="28"/>
           <w:szCs w:val="28"/>
-          <w:lang w:val="en-US"/>
         </w:rPr>
-        <w:t>1</w:t>
+        <w:t>Version 2.</w:t>
+      </w:r>
+      <w:r>
+        <w:rPr>
+          <w:b/>
+          <w:bCs/>
+          <w:sz w:val="28"/>
+          <w:szCs w:val="28"/>
+        </w:rPr>
+        <w:t>2</w:t>
       </w:r>
     </w:p>
     <w:p>
@@ -231,7 +181,6 @@
         <w:rPr>
           <w:sz w:val="18"/>
           <w:szCs w:val="18"/>
-          <w:lang w:val="en-US"/>
         </w:rPr>
       </w:pPr>
     </w:p>
@@ -242,7 +191,6 @@
         <w:rPr>
           <w:sz w:val="18"/>
           <w:szCs w:val="18"/>
-          <w:lang w:val="en-US"/>
         </w:rPr>
       </w:pPr>
     </w:p>
@@ -253,7 +201,6 @@
         <w:rPr>
           <w:sz w:val="18"/>
           <w:szCs w:val="18"/>
-          <w:lang w:val="en-US"/>
         </w:rPr>
       </w:pPr>
     </w:p>
@@ -264,7 +211,6 @@
         <w:rPr>
           <w:sz w:val="18"/>
           <w:szCs w:val="18"/>
-          <w:lang w:val="en-US"/>
         </w:rPr>
       </w:pPr>
     </w:p>
@@ -275,324 +221,15 @@
           <w:color w:val="1F3763" w:themeColor="accent1" w:themeShade="7F"/>
           <w:sz w:val="36"/>
           <w:szCs w:val="36"/>
-          <w:lang w:val="en-US"/>
         </w:rPr>
       </w:pPr>
       <w:r>
         <w:rPr>
           <w:sz w:val="36"/>
           <w:szCs w:val="36"/>
-          <w:lang w:val="en-US"/>
         </w:rPr>
         <w:br w:type="page"/>
       </w:r>
-    </w:p>
-    <w:p>
-      <w:pPr>
-        <w:pStyle w:val="Heading3"/>
-        <w:rPr>
-          <w:b/>
-          <w:bCs/>
-          <w:sz w:val="36"/>
-          <w:szCs w:val="36"/>
-          <w:lang w:val="en-US"/>
-        </w:rPr>
-      </w:pPr>
-      <w:r>
-        <w:rPr>
-          <w:b/>
-          <w:bCs/>
-          <w:sz w:val="36"/>
-          <w:szCs w:val="36"/>
-          <w:lang w:val="en-US"/>
-        </w:rPr>
-        <w:lastRenderedPageBreak/>
-        <w:t>Introduction</w:t>
-      </w:r>
-    </w:p>
-    <w:p>
-      <w:pPr>
-        <w:rPr>
-          <w:lang w:val="en-US"/>
-        </w:rPr>
-      </w:pPr>
-    </w:p>
-    <w:p>
-      <w:pPr>
-        <w:rPr>
-          <w:lang w:val="en-US"/>
-        </w:rPr>
-      </w:pPr>
-      <w:r>
-        <w:rPr>
-          <w:lang w:val="en-US"/>
-        </w:rPr>
-        <w:t>Here are some of the features of the camera (*):</w:t>
-      </w:r>
-    </w:p>
-    <w:p>
-      <w:pPr>
-        <w:pStyle w:val="ListParagraph"/>
-        <w:numPr>
-          <w:ilvl w:val="0"/>
-          <w:numId w:val="1"/>
-        </w:numPr>
-      </w:pPr>
-      <w:r>
-        <w:t>Weatherproof enclosure (IP67)</w:t>
-      </w:r>
-    </w:p>
-    <w:p>
-      <w:pPr>
-        <w:pStyle w:val="ListParagraph"/>
-        <w:numPr>
-          <w:ilvl w:val="0"/>
-          <w:numId w:val="1"/>
-        </w:numPr>
-      </w:pPr>
-      <w:r>
-        <w:t>2 mega pixels CMOS color sensor</w:t>
-      </w:r>
-    </w:p>
-    <w:p>
-      <w:pPr>
-        <w:pStyle w:val="ListParagraph"/>
-        <w:numPr>
-          <w:ilvl w:val="0"/>
-          <w:numId w:val="1"/>
-        </w:numPr>
-      </w:pPr>
-      <w:r>
-        <w:t>Various 4:3 and 16:9 resolutions from as small as 480x270 up to 1920x1080</w:t>
-      </w:r>
-    </w:p>
-    <w:p>
-      <w:pPr>
-        <w:pStyle w:val="ListParagraph"/>
-        <w:numPr>
-          <w:ilvl w:val="0"/>
-          <w:numId w:val="1"/>
-        </w:numPr>
-      </w:pPr>
-      <w:r>
-        <w:t>Selectable JPEG compression level</w:t>
-      </w:r>
-    </w:p>
-    <w:p>
-      <w:pPr>
-        <w:pStyle w:val="ListParagraph"/>
-        <w:numPr>
-          <w:ilvl w:val="0"/>
-          <w:numId w:val="1"/>
-        </w:numPr>
-      </w:pPr>
-      <w:r>
-        <w:t>Low light operation (0.0005 lux)</w:t>
-      </w:r>
-    </w:p>
-    <w:p>
-      <w:pPr>
-        <w:pStyle w:val="ListParagraph"/>
-        <w:numPr>
-          <w:ilvl w:val="0"/>
-          <w:numId w:val="1"/>
-        </w:numPr>
-      </w:pPr>
-      <w:r>
-        <w:t>IR LEDs for night mode operation (4pcs 850nm)</w:t>
-      </w:r>
-    </w:p>
-    <w:p>
-      <w:pPr>
-        <w:pStyle w:val="ListParagraph"/>
-        <w:numPr>
-          <w:ilvl w:val="0"/>
-          <w:numId w:val="1"/>
-        </w:numPr>
-      </w:pPr>
-      <w:r>
-        <w:t>Color in regular mode, black &amp; white in IR mode</w:t>
-      </w:r>
-    </w:p>
-    <w:p>
-      <w:pPr>
-        <w:pStyle w:val="ListParagraph"/>
-        <w:numPr>
-          <w:ilvl w:val="0"/>
-          <w:numId w:val="1"/>
-        </w:numPr>
-      </w:pPr>
-      <w:proofErr w:type="gramStart"/>
-      <w:r>
-        <w:t>50 meter</w:t>
-      </w:r>
-      <w:proofErr w:type="gramEnd"/>
-      <w:r>
-        <w:t xml:space="preserve"> cable</w:t>
-      </w:r>
-    </w:p>
-    <w:p>
-      <w:pPr>
-        <w:pStyle w:val="ListParagraph"/>
-        <w:numPr>
-          <w:ilvl w:val="0"/>
-          <w:numId w:val="1"/>
-        </w:numPr>
-      </w:pPr>
-      <w:r>
-        <w:t>RS-485 communications up to 115.2K baud</w:t>
-      </w:r>
-    </w:p>
-    <w:p>
-      <w:pPr>
-        <w:pStyle w:val="ListParagraph"/>
-        <w:numPr>
-          <w:ilvl w:val="0"/>
-          <w:numId w:val="1"/>
-        </w:numPr>
-      </w:pPr>
-      <w:r>
-        <w:t>-40C to +85C operating temperature</w:t>
-      </w:r>
-    </w:p>
-    <w:p>
-      <w:pPr>
-        <w:pStyle w:val="ListParagraph"/>
-        <w:numPr>
-          <w:ilvl w:val="0"/>
-          <w:numId w:val="1"/>
-        </w:numPr>
-      </w:pPr>
-      <w:r>
-        <w:t>-45C to +90C storage temperature</w:t>
-      </w:r>
-    </w:p>
-    <w:p>
-      <w:pPr>
-        <w:pStyle w:val="ListParagraph"/>
-        <w:numPr>
-          <w:ilvl w:val="0"/>
-          <w:numId w:val="1"/>
-        </w:numPr>
-      </w:pPr>
-      <w:r>
-        <w:t>90mm wide x 85mm height x 193mm depth</w:t>
-      </w:r>
-    </w:p>
-    <w:p>
-      <w:pPr>
-        <w:pStyle w:val="ListParagraph"/>
-        <w:numPr>
-          <w:ilvl w:val="0"/>
-          <w:numId w:val="1"/>
-        </w:numPr>
-      </w:pPr>
-      <w:r>
-        <w:t>Approximately 800 grams or 1lbs 8oz</w:t>
-      </w:r>
-    </w:p>
-    <w:p>
-      <w:pPr>
-        <w:pStyle w:val="ListParagraph"/>
-        <w:numPr>
-          <w:ilvl w:val="0"/>
-          <w:numId w:val="1"/>
-        </w:numPr>
-      </w:pPr>
-      <w:r>
-        <w:t>12V DC typical with support for 5 to 28V</w:t>
-      </w:r>
-    </w:p>
-    <w:p>
-      <w:pPr>
-        <w:pStyle w:val="ListParagraph"/>
-        <w:numPr>
-          <w:ilvl w:val="0"/>
-          <w:numId w:val="1"/>
-        </w:numPr>
-      </w:pPr>
-      <w:r>
-        <w:t>80 mA typical, 900 mA max</w:t>
-      </w:r>
-    </w:p>
-    <w:p>
-      <w:pPr>
-        <w:rPr>
-          <w:lang w:val="en-US"/>
-        </w:rPr>
-      </w:pPr>
-      <w:r>
-        <w:rPr>
-          <w:lang w:val="en-US"/>
-        </w:rPr>
-        <w:t xml:space="preserve">Contact your Ott </w:t>
-      </w:r>
-      <w:proofErr w:type="spellStart"/>
-      <w:r>
-        <w:rPr>
-          <w:lang w:val="en-US"/>
-        </w:rPr>
-        <w:t>Hydromet</w:t>
-      </w:r>
-      <w:proofErr w:type="spellEnd"/>
-      <w:r>
-        <w:rPr>
-          <w:lang w:val="en-US"/>
-        </w:rPr>
-        <w:t xml:space="preserve"> Territory Manager for information about purchasing the </w:t>
-      </w:r>
-      <w:proofErr w:type="spellStart"/>
-      <w:r>
-        <w:rPr>
-          <w:lang w:val="en-US"/>
-        </w:rPr>
-        <w:t>XLink</w:t>
-      </w:r>
-      <w:proofErr w:type="spellEnd"/>
-      <w:r>
-        <w:rPr>
-          <w:lang w:val="en-US"/>
-        </w:rPr>
-        <w:t xml:space="preserve"> or the camera.</w:t>
-      </w:r>
-    </w:p>
-    <w:p>
-      <w:pPr>
-        <w:rPr>
-          <w:lang w:val="en-US"/>
-        </w:rPr>
-      </w:pPr>
-    </w:p>
-    <w:p>
-      <w:pPr>
-        <w:rPr>
-          <w:sz w:val="22"/>
-          <w:szCs w:val="22"/>
-          <w:lang w:val="en-US"/>
-        </w:rPr>
-      </w:pPr>
-      <w:r>
-        <w:rPr>
-          <w:sz w:val="22"/>
-          <w:szCs w:val="22"/>
-          <w:lang w:val="en-US"/>
-        </w:rPr>
-        <w:t>(*) subject to change without notice.</w:t>
-      </w:r>
-    </w:p>
-    <w:p>
-      <w:pPr>
-        <w:rPr>
-          <w:lang w:val="en-US"/>
-        </w:rPr>
-      </w:pPr>
-    </w:p>
-    <w:p>
-      <w:pPr>
-        <w:rPr>
-          <w:lang w:val="en-US"/>
-        </w:rPr>
-      </w:pPr>
     </w:p>
     <w:p>
       <w:pPr>
@@ -611,6 +248,252 @@
           <w:sz w:val="36"/>
           <w:szCs w:val="36"/>
         </w:rPr>
+        <w:lastRenderedPageBreak/>
+        <w:t>Introduction</w:t>
+      </w:r>
+    </w:p>
+    <w:p/>
+    <w:p>
+      <w:r>
+        <w:t>This document describes how to connect Camera485 to XLink 500 in order to transmit images to a server.</w:t>
+      </w:r>
+    </w:p>
+    <w:p/>
+    <w:p/>
+    <w:p>
+      <w:r>
+        <w:t>Here are some of the features of the camera (*):</w:t>
+      </w:r>
+    </w:p>
+    <w:p>
+      <w:pPr>
+        <w:pStyle w:val="ListParagraph"/>
+        <w:numPr>
+          <w:ilvl w:val="0"/>
+          <w:numId w:val="1"/>
+        </w:numPr>
+      </w:pPr>
+      <w:r>
+        <w:t>Weatherproof enclosure (IP67)</w:t>
+      </w:r>
+    </w:p>
+    <w:p>
+      <w:pPr>
+        <w:pStyle w:val="ListParagraph"/>
+        <w:numPr>
+          <w:ilvl w:val="0"/>
+          <w:numId w:val="1"/>
+        </w:numPr>
+      </w:pPr>
+      <w:r>
+        <w:t>2 mega pixels CMOS color sensor</w:t>
+      </w:r>
+    </w:p>
+    <w:p>
+      <w:pPr>
+        <w:pStyle w:val="ListParagraph"/>
+        <w:numPr>
+          <w:ilvl w:val="0"/>
+          <w:numId w:val="1"/>
+        </w:numPr>
+      </w:pPr>
+      <w:r>
+        <w:t>Various 4:3 and 16:9 resolutions from as small as 480x270 up to 1920x1080</w:t>
+      </w:r>
+    </w:p>
+    <w:p>
+      <w:pPr>
+        <w:pStyle w:val="ListParagraph"/>
+        <w:numPr>
+          <w:ilvl w:val="0"/>
+          <w:numId w:val="1"/>
+        </w:numPr>
+      </w:pPr>
+      <w:r>
+        <w:t>Selectable JPEG compression level</w:t>
+      </w:r>
+    </w:p>
+    <w:p>
+      <w:pPr>
+        <w:pStyle w:val="ListParagraph"/>
+        <w:numPr>
+          <w:ilvl w:val="0"/>
+          <w:numId w:val="1"/>
+        </w:numPr>
+      </w:pPr>
+      <w:r>
+        <w:t>Low light operation (0.0005 lux)</w:t>
+      </w:r>
+    </w:p>
+    <w:p>
+      <w:pPr>
+        <w:pStyle w:val="ListParagraph"/>
+        <w:numPr>
+          <w:ilvl w:val="0"/>
+          <w:numId w:val="1"/>
+        </w:numPr>
+      </w:pPr>
+      <w:r>
+        <w:t>IR LEDs for night mode operation (4pcs 850nm)</w:t>
+      </w:r>
+    </w:p>
+    <w:p>
+      <w:pPr>
+        <w:pStyle w:val="ListParagraph"/>
+        <w:numPr>
+          <w:ilvl w:val="0"/>
+          <w:numId w:val="1"/>
+        </w:numPr>
+      </w:pPr>
+      <w:r>
+        <w:t>Color in regular mode, black &amp; white in IR mode</w:t>
+      </w:r>
+    </w:p>
+    <w:p>
+      <w:pPr>
+        <w:pStyle w:val="ListParagraph"/>
+        <w:numPr>
+          <w:ilvl w:val="0"/>
+          <w:numId w:val="1"/>
+        </w:numPr>
+      </w:pPr>
+      <w:r>
+        <w:t>50 meter cable</w:t>
+      </w:r>
+    </w:p>
+    <w:p>
+      <w:pPr>
+        <w:pStyle w:val="ListParagraph"/>
+        <w:numPr>
+          <w:ilvl w:val="0"/>
+          <w:numId w:val="1"/>
+        </w:numPr>
+      </w:pPr>
+      <w:r>
+        <w:t>RS-485 communications up to 115.2K baud</w:t>
+      </w:r>
+    </w:p>
+    <w:p>
+      <w:pPr>
+        <w:pStyle w:val="ListParagraph"/>
+        <w:numPr>
+          <w:ilvl w:val="0"/>
+          <w:numId w:val="1"/>
+        </w:numPr>
+      </w:pPr>
+      <w:r>
+        <w:t>-40C to +85C operating temperature</w:t>
+      </w:r>
+    </w:p>
+    <w:p>
+      <w:pPr>
+        <w:pStyle w:val="ListParagraph"/>
+        <w:numPr>
+          <w:ilvl w:val="0"/>
+          <w:numId w:val="1"/>
+        </w:numPr>
+      </w:pPr>
+      <w:r>
+        <w:t>-45C to +90C storage temperature</w:t>
+      </w:r>
+    </w:p>
+    <w:p>
+      <w:pPr>
+        <w:pStyle w:val="ListParagraph"/>
+        <w:numPr>
+          <w:ilvl w:val="0"/>
+          <w:numId w:val="1"/>
+        </w:numPr>
+      </w:pPr>
+      <w:r>
+        <w:t>90mm wide x 85mm height x 193mm depth</w:t>
+      </w:r>
+    </w:p>
+    <w:p>
+      <w:pPr>
+        <w:pStyle w:val="ListParagraph"/>
+        <w:numPr>
+          <w:ilvl w:val="0"/>
+          <w:numId w:val="1"/>
+        </w:numPr>
+      </w:pPr>
+      <w:r>
+        <w:t>Approximately 800 grams or 1lbs 8oz</w:t>
+      </w:r>
+    </w:p>
+    <w:p>
+      <w:pPr>
+        <w:pStyle w:val="ListParagraph"/>
+        <w:numPr>
+          <w:ilvl w:val="0"/>
+          <w:numId w:val="1"/>
+        </w:numPr>
+      </w:pPr>
+      <w:r>
+        <w:t>12V DC typical with support for 5 to 28V</w:t>
+      </w:r>
+    </w:p>
+    <w:p>
+      <w:pPr>
+        <w:pStyle w:val="ListParagraph"/>
+        <w:numPr>
+          <w:ilvl w:val="0"/>
+          <w:numId w:val="1"/>
+        </w:numPr>
+      </w:pPr>
+      <w:r>
+        <w:t>80 mA typical, 900 mA max</w:t>
+      </w:r>
+    </w:p>
+    <w:p>
+      <w:r>
+        <w:t xml:space="preserve">Contact your Ott </w:t>
+      </w:r>
+      <w:proofErr w:type="spellStart"/>
+      <w:r>
+        <w:t>Hydromet</w:t>
+      </w:r>
+      <w:proofErr w:type="spellEnd"/>
+      <w:r>
+        <w:t xml:space="preserve"> Territory Manager for information about purchasing the XLink or the camera.</w:t>
+      </w:r>
+    </w:p>
+    <w:p/>
+    <w:p>
+      <w:pPr>
+        <w:rPr>
+          <w:sz w:val="22"/>
+          <w:szCs w:val="22"/>
+        </w:rPr>
+      </w:pPr>
+      <w:r>
+        <w:rPr>
+          <w:sz w:val="22"/>
+          <w:szCs w:val="22"/>
+        </w:rPr>
+        <w:t>(*) subject to change without notice.</w:t>
+      </w:r>
+    </w:p>
+    <w:p/>
+    <w:p/>
+    <w:p>
+      <w:pPr>
+        <w:pStyle w:val="Heading3"/>
+        <w:rPr>
+          <w:b/>
+          <w:bCs/>
+          <w:sz w:val="36"/>
+          <w:szCs w:val="36"/>
+        </w:rPr>
+      </w:pPr>
+      <w:r>
+        <w:rPr>
+          <w:b/>
+          <w:bCs/>
+          <w:sz w:val="36"/>
+          <w:szCs w:val="36"/>
+        </w:rPr>
+        <w:lastRenderedPageBreak/>
         <w:t>Wiring Diagram</w:t>
       </w:r>
     </w:p>
@@ -619,9 +502,6 @@
         <w:jc w:val="center"/>
       </w:pPr>
       <w:r>
-        <w:rPr>
-          <w:noProof/>
-        </w:rPr>
         <w:drawing>
           <wp:inline distT="0" distB="0" distL="0" distR="0" wp14:anchorId="789FE6C7" wp14:editId="394E87D4">
             <wp:extent cx="5677786" cy="5319000"/>
@@ -674,25 +554,17 @@
     </w:p>
     <w:p/>
     <w:p>
-      <w:pPr>
-        <w:rPr>
-          <w:lang w:val="en-US"/>
-        </w:rPr>
-      </w:pPr>
-      <w:r>
-        <w:rPr>
-          <w:lang w:val="en-US"/>
-        </w:rPr>
-        <w:t>Camera485 has a 4-wire cable that is connected to the XLink-500’s RS485 and SW’D +12V power. See the picture above or the table below for connectivity.</w:t>
-      </w:r>
-    </w:p>
-    <w:p>
-      <w:pPr>
-        <w:rPr>
-          <w:lang w:val="en-US"/>
-        </w:rPr>
-      </w:pPr>
-    </w:p>
+      <w:r>
+        <w:t>Camera485 has a 4-wire cable that is connected to the XLink</w:t>
+      </w:r>
+      <w:r>
+        <w:t xml:space="preserve"> </w:t>
+      </w:r>
+      <w:r>
+        <w:t>500’s RS485 and SW’D +12V power. See the picture above or the table below for connectivity.</w:t>
+      </w:r>
+    </w:p>
+    <w:p/>
     <w:tbl>
       <w:tblPr>
         <w:tblStyle w:val="PlainTable5"/>
@@ -738,7 +610,21 @@
                 <w:b/>
                 <w:bCs/>
               </w:rPr>
-              <w:t>XLink-500</w:t>
+              <w:t>XLink</w:t>
+            </w:r>
+            <w:r>
+              <w:rPr>
+                <w:b/>
+                <w:bCs/>
+              </w:rPr>
+              <w:t xml:space="preserve"> </w:t>
+            </w:r>
+            <w:r>
+              <w:rPr>
+                <w:b/>
+                <w:bCs/>
+              </w:rPr>
+              <w:t>500</w:t>
             </w:r>
           </w:p>
         </w:tc>
@@ -821,7 +707,6 @@
         <w:tc>
           <w:tcPr>
             <w:tcW w:w="2070" w:type="dxa"/>
-            <w:shd w:val="clear" w:color="auto" w:fill="auto"/>
           </w:tcPr>
           <w:p>
             <w:pPr>
@@ -886,7 +771,6 @@
         <w:tc>
           <w:tcPr>
             <w:tcW w:w="2070" w:type="dxa"/>
-            <w:shd w:val="clear" w:color="auto" w:fill="auto"/>
           </w:tcPr>
           <w:p>
             <w:pPr>
@@ -906,7 +790,6 @@
         <w:rPr>
           <w:sz w:val="18"/>
           <w:szCs w:val="18"/>
-          <w:lang w:val="en-US"/>
         </w:rPr>
       </w:pPr>
     </w:p>
@@ -919,7 +802,6 @@
           <w:bCs/>
           <w:sz w:val="36"/>
           <w:szCs w:val="36"/>
-          <w:lang w:val="en-US"/>
         </w:rPr>
       </w:pPr>
       <w:bookmarkStart w:id="0" w:name="_Toc102375557"/>
@@ -929,8 +811,8 @@
           <w:bCs/>
           <w:sz w:val="36"/>
           <w:szCs w:val="36"/>
-          <w:lang w:val="en-US"/>
         </w:rPr>
+        <w:lastRenderedPageBreak/>
         <w:t>Configuring the Camera Script</w:t>
       </w:r>
     </w:p>
@@ -944,7 +826,6 @@
           <w:bCs/>
           <w:sz w:val="28"/>
           <w:szCs w:val="28"/>
-          <w:lang w:val="en-US"/>
         </w:rPr>
       </w:pPr>
       <w:r>
@@ -953,7 +834,6 @@
           <w:bCs/>
           <w:sz w:val="28"/>
           <w:szCs w:val="28"/>
-          <w:lang w:val="en-US"/>
         </w:rPr>
         <w:t>Overview</w:t>
       </w:r>
@@ -961,65 +841,36 @@
     <w:p>
       <w:pPr>
         <w:ind w:left="720"/>
-        <w:rPr>
-          <w:lang w:val="en-US"/>
-        </w:rPr>
-      </w:pPr>
-      <w:r>
-        <w:rPr>
-          <w:lang w:val="en-US"/>
-        </w:rPr>
-        <w:t xml:space="preserve">The script is called Camera485.py and before loading it in to your XLink500 using </w:t>
-      </w:r>
-      <w:proofErr w:type="spellStart"/>
-      <w:r>
-        <w:rPr>
-          <w:lang w:val="en-US"/>
-        </w:rPr>
-        <w:t>LinkComm</w:t>
-      </w:r>
-      <w:proofErr w:type="spellEnd"/>
-      <w:r>
-        <w:rPr>
-          <w:lang w:val="en-US"/>
-        </w:rPr>
-        <w:t>, you may wish to review or change the default settings in the program. To do so open the file in a text or program editor such as Notepad or PyCharm. The settings you may wish to change are defined as variables near the beginning of the program. Make any changes you wish and save the file.</w:t>
+      </w:pPr>
+      <w:r>
+        <w:t>The script is called Camera485.py and before loading it in to your XLink500 using LinkComm, you may wish to review or change the default settings in the program. To do so</w:t>
+      </w:r>
+      <w:r>
+        <w:t>,</w:t>
+      </w:r>
+      <w:r>
+        <w:t xml:space="preserve"> open the file in a text or program editor such as Notepad or PyCharm. The settings you may wish to change are defined as variables near the beginning of the program. Make any changes you wish and save the file.</w:t>
       </w:r>
     </w:p>
     <w:p>
       <w:pPr>
         <w:ind w:left="720"/>
-        <w:rPr>
-          <w:lang w:val="en-US"/>
-        </w:rPr>
-      </w:pPr>
-      <w:r>
-        <w:rPr>
-          <w:lang w:val="en-US"/>
-        </w:rPr>
+      </w:pPr>
+      <w:r>
         <w:t>The camera script is currently proprietary and should either be supplied with the camera or delivered separately via email.</w:t>
       </w:r>
     </w:p>
     <w:p>
       <w:pPr>
         <w:ind w:left="720"/>
-        <w:rPr>
-          <w:lang w:val="en-US"/>
-        </w:rPr>
-      </w:pPr>
-      <w:r>
-        <w:rPr>
-          <w:lang w:val="en-US"/>
-        </w:rPr>
+      </w:pPr>
+      <w:r>
         <w:t>Here is a high-level block diagram for the workflow of the program:</w:t>
       </w:r>
     </w:p>
     <w:p>
       <w:pPr>
         <w:ind w:left="720"/>
-        <w:rPr>
-          <w:lang w:val="en-US"/>
-        </w:rPr>
       </w:pPr>
     </w:p>
     <w:p>
@@ -1027,9 +878,6 @@
         <w:ind w:left="720"/>
       </w:pPr>
       <w:r>
-        <w:rPr>
-          <w:noProof/>
-        </w:rPr>
         <w:drawing>
           <wp:inline distT="0" distB="0" distL="0" distR="0" wp14:anchorId="5E85FBCA" wp14:editId="45B8E3E9">
             <wp:extent cx="5263117" cy="5103628"/>
@@ -1056,7 +904,6 @@
           <w:bCs/>
           <w:sz w:val="28"/>
           <w:szCs w:val="28"/>
-          <w:lang w:val="en-US"/>
         </w:rPr>
       </w:pPr>
       <w:r>
@@ -1065,45 +912,32 @@
           <w:bCs/>
           <w:sz w:val="28"/>
           <w:szCs w:val="28"/>
-          <w:lang w:val="en-US"/>
         </w:rPr>
+        <w:lastRenderedPageBreak/>
         <w:t>Settings</w:t>
       </w:r>
     </w:p>
     <w:p>
       <w:pPr>
         <w:ind w:left="720"/>
-        <w:rPr>
-          <w:lang w:val="en-US"/>
-        </w:rPr>
-      </w:pPr>
-      <w:r>
-        <w:rPr>
-          <w:lang w:val="en-US"/>
-        </w:rPr>
+      </w:pPr>
+      <w:r>
         <w:t xml:space="preserve">This is a list of the settings that can be made by modifying the script (you may not need to change any of these settings, but consider the </w:t>
       </w:r>
       <w:r>
         <w:rPr>
           <w:b/>
           <w:bCs/>
-          <w:lang w:val="en-US"/>
         </w:rPr>
         <w:t>bolded</w:t>
       </w:r>
       <w:r>
-        <w:rPr>
-          <w:lang w:val="en-US"/>
-        </w:rPr>
         <w:t xml:space="preserve"> items):</w:t>
       </w:r>
     </w:p>
     <w:p>
       <w:pPr>
         <w:ind w:left="720"/>
-        <w:rPr>
-          <w:lang w:val="en-US"/>
-        </w:rPr>
       </w:pPr>
     </w:p>
     <w:tbl>
@@ -1270,40 +1104,15 @@
                 <w:sz w:val="16"/>
                 <w:szCs w:val="16"/>
               </w:rPr>
-              <w:t>/</w:t>
-            </w:r>
-            <w:proofErr w:type="spellStart"/>
+              <w:t>/Sutron/Camera485/</w:t>
+            </w:r>
             <w:r>
               <w:rPr>
                 <w:rFonts w:asciiTheme="minorHAnsi" w:hAnsiTheme="minorHAnsi"/>
                 <w:sz w:val="16"/>
                 <w:szCs w:val="16"/>
               </w:rPr>
-              <w:t>Sutron</w:t>
-            </w:r>
-            <w:proofErr w:type="spellEnd"/>
-            <w:r>
-              <w:rPr>
-                <w:rFonts w:asciiTheme="minorHAnsi" w:hAnsiTheme="minorHAnsi"/>
-                <w:sz w:val="16"/>
-                <w:szCs w:val="16"/>
-              </w:rPr>
-              <w:t>/Camera485/</w:t>
-            </w:r>
-            <w:r>
-              <w:rPr>
-                <w:rFonts w:asciiTheme="minorHAnsi" w:hAnsiTheme="minorHAnsi"/>
-                <w:sz w:val="16"/>
-                <w:szCs w:val="16"/>
-              </w:rPr>
               <w:br/>
-            </w:r>
-            <w:r>
-              <w:rPr>
-                <w:rFonts w:asciiTheme="minorHAnsi" w:hAnsiTheme="minorHAnsi"/>
-                <w:sz w:val="16"/>
-                <w:szCs w:val="16"/>
-              </w:rPr>
               <w:t>{YYYY}{MM}{DD}"</w:t>
             </w:r>
           </w:p>
@@ -1314,10 +1123,7 @@
           </w:tcPr>
           <w:p>
             <w:r>
-              <w:t>where to store each snapshot</w:t>
-            </w:r>
-            <w:r>
-              <w:t xml:space="preserve"> (folder may include elements of the current date and time)</w:t>
+              <w:t>where to store each snapshot (folder may include elements of the current date and time)</w:t>
             </w:r>
           </w:p>
           <w:p>
@@ -1417,13 +1223,6 @@
                 <w:szCs w:val="16"/>
               </w:rPr>
               <w:br/>
-            </w:r>
-            <w:r>
-              <w:rPr>
-                <w:rFonts w:asciiTheme="minorHAnsi" w:hAnsiTheme="minorHAnsi"/>
-                <w:sz w:val="16"/>
-                <w:szCs w:val="16"/>
-              </w:rPr>
               <w:t>{</w:t>
             </w:r>
             <w:proofErr w:type="spellStart"/>
@@ -1585,10 +1384,7 @@
           </w:tcPr>
           <w:p>
             <w:r>
-              <w:t>where to store images for transmission</w:t>
-            </w:r>
-            <w:r>
-              <w:t>, so for instance, if you prefer to configure your cell FTP with TX2, change this value to “/</w:t>
+              <w:t>where to store images for transmission, so for instance, if you prefer to configure your cell FTP with TX2, change this value to “/</w:t>
             </w:r>
             <w:proofErr w:type="spellStart"/>
             <w:r>
@@ -1739,6 +1535,7 @@
           <w:p>
             <w:proofErr w:type="spellStart"/>
             <w:r>
+              <w:lastRenderedPageBreak/>
               <w:t>ledMode</w:t>
             </w:r>
             <w:proofErr w:type="spellEnd"/>
@@ -1778,13 +1575,7 @@
             </w:r>
             <w:proofErr w:type="spellEnd"/>
             <w:r>
-              <w:t xml:space="preserve">, </w:t>
-            </w:r>
-            <w:r>
-              <w:t xml:space="preserve">or </w:t>
-            </w:r>
-            <w:r>
-              <w:t>None for auto switching</w:t>
+              <w:t>, or None for auto switching</w:t>
             </w:r>
           </w:p>
           <w:p>
@@ -1848,15 +1639,7 @@
           </w:p>
           <w:p>
             <w:r>
-              <w:t>the default text overlay contains the station name and the current time in MM/DD/YYYY HH:</w:t>
-            </w:r>
-            <w:proofErr w:type="gramStart"/>
-            <w:r>
-              <w:t>MM:SS</w:t>
-            </w:r>
-            <w:proofErr w:type="gramEnd"/>
-            <w:r>
-              <w:t xml:space="preserve"> format</w:t>
+              <w:t>the default text overlay contains the station name and the current time in MM/DD/YYYY HH:MM:SS format</w:t>
             </w:r>
           </w:p>
           <w:p>
@@ -1864,17 +1647,12 @@
               <w:t xml:space="preserve">the contents are generated by the </w:t>
             </w:r>
             <w:proofErr w:type="spellStart"/>
-            <w:proofErr w:type="gramStart"/>
             <w:r>
               <w:t>GetOverlayText</w:t>
             </w:r>
             <w:proofErr w:type="spellEnd"/>
             <w:r>
-              <w:t>(</w:t>
-            </w:r>
-            <w:proofErr w:type="gramEnd"/>
-            <w:r>
-              <w:t>) function and this code can be modified to suit your own purposes, for instance you might wish to insert the value of a measurement</w:t>
+              <w:t>() function and this code can be modified to suit your own purposes, for instance you might wish to insert the value of a measurement</w:t>
             </w:r>
           </w:p>
         </w:tc>
@@ -1928,16 +1706,7 @@
           </w:tcPr>
           <w:p>
             <w:r>
-              <w:t xml:space="preserve">horizontal pixel position of </w:t>
-            </w:r>
-            <w:r>
-              <w:t xml:space="preserve">the </w:t>
-            </w:r>
-            <w:r>
-              <w:t>text</w:t>
-            </w:r>
-            <w:r>
-              <w:t xml:space="preserve"> overlay</w:t>
+              <w:t>horizontal pixel position of the text overlay</w:t>
             </w:r>
           </w:p>
         </w:tc>
@@ -1991,16 +1760,7 @@
           </w:tcPr>
           <w:p>
             <w:r>
-              <w:t xml:space="preserve">vertical pixel position of </w:t>
-            </w:r>
-            <w:r>
-              <w:t xml:space="preserve">the text </w:t>
-            </w:r>
-            <w:r>
-              <w:t>overlay</w:t>
-            </w:r>
-            <w:r>
-              <w:t xml:space="preserve"> (the default value of 10, places the text near the top of the picture)</w:t>
+              <w:t>vertical pixel position of the text overlay (the default value of 10, places the text near the top of the picture)</w:t>
             </w:r>
           </w:p>
           <w:p>
@@ -2064,10 +1824,7 @@
           </w:tcPr>
           <w:p>
             <w:r>
-              <w:t xml:space="preserve">font height for </w:t>
-            </w:r>
-            <w:r>
-              <w:t>the text overlay in pixels</w:t>
+              <w:t>font height for the text overlay in pixels</w:t>
             </w:r>
           </w:p>
         </w:tc>
@@ -2165,10 +1922,7 @@
           </w:tcPr>
           <w:p>
             <w:r>
-              <w:t xml:space="preserve">resolution to take pictures </w:t>
-            </w:r>
-            <w:r>
-              <w:t>(horizontal pixels by vertical pixels)</w:t>
+              <w:t>resolution to take pictures (horizontal pixels by vertical pixels)</w:t>
             </w:r>
           </w:p>
           <w:p>
@@ -2202,231 +1956,7 @@
                 <w:rFonts w:asciiTheme="minorHAnsi" w:hAnsiTheme="minorHAnsi"/>
                 <w:sz w:val="22"/>
               </w:rPr>
-              <w:t>"640x480",</w:t>
-            </w:r>
-            <w:r>
-              <w:rPr>
-                <w:rFonts w:asciiTheme="minorHAnsi" w:hAnsiTheme="minorHAnsi"/>
-                <w:sz w:val="22"/>
-              </w:rPr>
-              <w:t xml:space="preserve"> </w:t>
-            </w:r>
-            <w:r>
-              <w:rPr>
-                <w:rFonts w:asciiTheme="minorHAnsi" w:hAnsiTheme="minorHAnsi"/>
-                <w:sz w:val="22"/>
-              </w:rPr>
-              <w:t>"1280x960",</w:t>
-            </w:r>
-            <w:r>
-              <w:rPr>
-                <w:rFonts w:asciiTheme="minorHAnsi" w:hAnsiTheme="minorHAnsi"/>
-                <w:sz w:val="22"/>
-              </w:rPr>
-              <w:t xml:space="preserve"> </w:t>
-            </w:r>
-            <w:r>
-              <w:rPr>
-                <w:rFonts w:asciiTheme="minorHAnsi" w:hAnsiTheme="minorHAnsi"/>
-                <w:sz w:val="22"/>
-              </w:rPr>
-              <w:t>"800x600",</w:t>
-            </w:r>
-            <w:r>
-              <w:rPr>
-                <w:rFonts w:asciiTheme="minorHAnsi" w:hAnsiTheme="minorHAnsi"/>
-                <w:sz w:val="22"/>
-              </w:rPr>
-              <w:t xml:space="preserve"> </w:t>
-            </w:r>
-            <w:r>
-              <w:rPr>
-                <w:rFonts w:asciiTheme="minorHAnsi" w:hAnsiTheme="minorHAnsi"/>
-                <w:sz w:val="22"/>
-              </w:rPr>
-              <w:t>"1024x768",</w:t>
-            </w:r>
-            <w:r>
-              <w:rPr>
-                <w:rFonts w:asciiTheme="minorHAnsi" w:hAnsiTheme="minorHAnsi"/>
-                <w:sz w:val="22"/>
-              </w:rPr>
-              <w:t xml:space="preserve"> </w:t>
-            </w:r>
-            <w:r>
-              <w:rPr>
-                <w:rFonts w:asciiTheme="minorHAnsi" w:hAnsiTheme="minorHAnsi"/>
-                <w:sz w:val="22"/>
-              </w:rPr>
-              <w:t>"1600x1024",</w:t>
-            </w:r>
-            <w:r>
-              <w:rPr>
-                <w:rFonts w:asciiTheme="minorHAnsi" w:hAnsiTheme="minorHAnsi"/>
-                <w:sz w:val="22"/>
-              </w:rPr>
-              <w:t xml:space="preserve"> </w:t>
-            </w:r>
-            <w:r>
-              <w:rPr>
-                <w:rFonts w:asciiTheme="minorHAnsi" w:hAnsiTheme="minorHAnsi"/>
-                <w:sz w:val="22"/>
-              </w:rPr>
-              <w:t>"1600x1200",</w:t>
-            </w:r>
-            <w:r>
-              <w:rPr>
-                <w:rFonts w:asciiTheme="minorHAnsi" w:hAnsiTheme="minorHAnsi"/>
-                <w:sz w:val="22"/>
-              </w:rPr>
-              <w:t xml:space="preserve"> </w:t>
-            </w:r>
-            <w:r>
-              <w:rPr>
-                <w:rFonts w:asciiTheme="minorHAnsi" w:hAnsiTheme="minorHAnsi"/>
-                <w:sz w:val="22"/>
-              </w:rPr>
-              <w:t>"1280x720",</w:t>
-            </w:r>
-            <w:r>
-              <w:rPr>
-                <w:rFonts w:asciiTheme="minorHAnsi" w:hAnsiTheme="minorHAnsi"/>
-                <w:sz w:val="22"/>
-              </w:rPr>
-              <w:t xml:space="preserve"> </w:t>
-            </w:r>
-            <w:r>
-              <w:rPr>
-                <w:rFonts w:asciiTheme="minorHAnsi" w:hAnsiTheme="minorHAnsi"/>
-                <w:sz w:val="22"/>
-              </w:rPr>
-              <w:t>"1920x1080",</w:t>
-            </w:r>
-            <w:r>
-              <w:rPr>
-                <w:rFonts w:asciiTheme="minorHAnsi" w:hAnsiTheme="minorHAnsi"/>
-                <w:sz w:val="22"/>
-              </w:rPr>
-              <w:t xml:space="preserve"> </w:t>
-            </w:r>
-            <w:r>
-              <w:rPr>
-                <w:rFonts w:asciiTheme="minorHAnsi" w:hAnsiTheme="minorHAnsi"/>
-                <w:sz w:val="22"/>
-              </w:rPr>
-              <w:t>"1280x1024",</w:t>
-            </w:r>
-            <w:r>
-              <w:rPr>
-                <w:rFonts w:asciiTheme="minorHAnsi" w:hAnsiTheme="minorHAnsi"/>
-                <w:sz w:val="22"/>
-              </w:rPr>
-              <w:t xml:space="preserve"> </w:t>
-            </w:r>
-            <w:r>
-              <w:rPr>
-                <w:rFonts w:asciiTheme="minorHAnsi" w:hAnsiTheme="minorHAnsi"/>
-                <w:sz w:val="22"/>
-              </w:rPr>
-              <w:t>"480x270",</w:t>
-            </w:r>
-            <w:r>
-              <w:rPr>
-                <w:rFonts w:asciiTheme="minorHAnsi" w:hAnsiTheme="minorHAnsi"/>
-                <w:sz w:val="22"/>
-              </w:rPr>
-              <w:t xml:space="preserve"> </w:t>
-            </w:r>
-            <w:r>
-              <w:rPr>
-                <w:rFonts w:asciiTheme="minorHAnsi" w:hAnsiTheme="minorHAnsi"/>
-                <w:sz w:val="22"/>
-              </w:rPr>
-              <w:t>"640x360",</w:t>
-            </w:r>
-            <w:r>
-              <w:rPr>
-                <w:rFonts w:asciiTheme="minorHAnsi" w:hAnsiTheme="minorHAnsi"/>
-                <w:sz w:val="22"/>
-              </w:rPr>
-              <w:t xml:space="preserve"> </w:t>
-            </w:r>
-            <w:r>
-              <w:rPr>
-                <w:rFonts w:asciiTheme="minorHAnsi" w:hAnsiTheme="minorHAnsi"/>
-                <w:sz w:val="22"/>
-              </w:rPr>
-              <w:t>"800x450",</w:t>
-            </w:r>
-            <w:r>
-              <w:rPr>
-                <w:rFonts w:asciiTheme="minorHAnsi" w:hAnsiTheme="minorHAnsi"/>
-                <w:sz w:val="22"/>
-              </w:rPr>
-              <w:t xml:space="preserve"> </w:t>
-            </w:r>
-            <w:r>
-              <w:rPr>
-                <w:rFonts w:asciiTheme="minorHAnsi" w:hAnsiTheme="minorHAnsi"/>
-                <w:sz w:val="22"/>
-              </w:rPr>
-              <w:t>"960x540",</w:t>
-            </w:r>
-            <w:r>
-              <w:rPr>
-                <w:rFonts w:asciiTheme="minorHAnsi" w:hAnsiTheme="minorHAnsi"/>
-                <w:sz w:val="22"/>
-              </w:rPr>
-              <w:t xml:space="preserve"> </w:t>
-            </w:r>
-            <w:r>
-              <w:rPr>
-                <w:rFonts w:asciiTheme="minorHAnsi" w:hAnsiTheme="minorHAnsi"/>
-                <w:sz w:val="22"/>
-              </w:rPr>
-              <w:t>"1024x576",</w:t>
-            </w:r>
-            <w:r>
-              <w:rPr>
-                <w:rFonts w:asciiTheme="minorHAnsi" w:hAnsiTheme="minorHAnsi"/>
-                <w:sz w:val="22"/>
-              </w:rPr>
-              <w:t xml:space="preserve"> </w:t>
-            </w:r>
-            <w:r>
-              <w:rPr>
-                <w:rFonts w:asciiTheme="minorHAnsi" w:hAnsiTheme="minorHAnsi"/>
-                <w:sz w:val="22"/>
-              </w:rPr>
-              <w:t>"1366x768",</w:t>
-            </w:r>
-            <w:r>
-              <w:rPr>
-                <w:rFonts w:asciiTheme="minorHAnsi" w:hAnsiTheme="minorHAnsi"/>
-                <w:sz w:val="22"/>
-              </w:rPr>
-              <w:t xml:space="preserve"> </w:t>
-            </w:r>
-            <w:r>
-              <w:rPr>
-                <w:rFonts w:asciiTheme="minorHAnsi" w:hAnsiTheme="minorHAnsi"/>
-                <w:sz w:val="22"/>
-              </w:rPr>
-              <w:t>"1440x810",</w:t>
-            </w:r>
-            <w:r>
-              <w:rPr>
-                <w:rFonts w:asciiTheme="minorHAnsi" w:hAnsiTheme="minorHAnsi"/>
-                <w:sz w:val="22"/>
-              </w:rPr>
-              <w:t xml:space="preserve"> </w:t>
-            </w:r>
-            <w:r>
-              <w:rPr>
-                <w:rFonts w:asciiTheme="minorHAnsi" w:hAnsiTheme="minorHAnsi"/>
-                <w:sz w:val="22"/>
-              </w:rPr>
-              <w:t>"1600x900"</w:t>
+              <w:t>"640x480", "1280x960", "800x600", "1024x768", "1600x1024", "1600x1200", "1280x720", "1920x1080", "1280x1024", "480x270", "640x360", "800x450", "960x540", "1024x576", "1366x768", "1440x810", "1600x900"</w:t>
             </w:r>
           </w:p>
           <w:p>
@@ -2495,13 +2025,7 @@
           </w:tcPr>
           <w:p>
             <w:r>
-              <w:t>compression ratio</w:t>
-            </w:r>
-            <w:r>
-              <w:t xml:space="preserve"> </w:t>
-            </w:r>
-            <w:r>
-              <w:t>(1 - 5) larger value is more compressed, 1 is the highest quality</w:t>
+              <w:t>compression ratio (1 - 5) larger value is more compressed, 1 is the highest quality</w:t>
             </w:r>
           </w:p>
         </w:tc>
@@ -2514,6 +2038,7 @@
           <w:p>
             <w:proofErr w:type="spellStart"/>
             <w:r>
+              <w:lastRenderedPageBreak/>
               <w:t>retrySettings</w:t>
             </w:r>
             <w:proofErr w:type="spellEnd"/>
@@ -2596,65 +2121,23 @@
                 <w:rFonts w:asciiTheme="minorHAnsi" w:hAnsiTheme="minorHAnsi" w:cstheme="minorHAnsi"/>
                 <w:sz w:val="22"/>
               </w:rPr>
-              <w:t xml:space="preserve">it is a list of </w:t>
-            </w:r>
+              <w:t xml:space="preserve">it is a list of resolutions and compressions value to attempt in case the </w:t>
+            </w:r>
+            <w:proofErr w:type="spellStart"/>
             <w:r>
               <w:rPr>
                 <w:rFonts w:asciiTheme="minorHAnsi" w:hAnsiTheme="minorHAnsi" w:cstheme="minorHAnsi"/>
                 <w:sz w:val="22"/>
               </w:rPr>
-              <w:t xml:space="preserve">resolutions </w:t>
-            </w:r>
+              <w:t>defaultResolution</w:t>
+            </w:r>
+            <w:proofErr w:type="spellEnd"/>
             <w:r>
               <w:rPr>
                 <w:rFonts w:asciiTheme="minorHAnsi" w:hAnsiTheme="minorHAnsi" w:cstheme="minorHAnsi"/>
                 <w:sz w:val="22"/>
               </w:rPr>
-              <w:t xml:space="preserve">and compressions value </w:t>
-            </w:r>
-            <w:r>
-              <w:rPr>
-                <w:rFonts w:asciiTheme="minorHAnsi" w:hAnsiTheme="minorHAnsi" w:cstheme="minorHAnsi"/>
-                <w:sz w:val="22"/>
-              </w:rPr>
-              <w:t xml:space="preserve">to attempt in case the </w:t>
-            </w:r>
-            <w:proofErr w:type="spellStart"/>
-            <w:r>
-              <w:rPr>
-                <w:rFonts w:asciiTheme="minorHAnsi" w:hAnsiTheme="minorHAnsi" w:cstheme="minorHAnsi"/>
-                <w:sz w:val="22"/>
-              </w:rPr>
-              <w:t>defaultResolution</w:t>
-            </w:r>
-            <w:proofErr w:type="spellEnd"/>
-            <w:r>
-              <w:rPr>
-                <w:rFonts w:asciiTheme="minorHAnsi" w:hAnsiTheme="minorHAnsi" w:cstheme="minorHAnsi"/>
-                <w:sz w:val="22"/>
-              </w:rPr>
-              <w:t xml:space="preserve"> </w:t>
-            </w:r>
-            <w:r>
-              <w:rPr>
-                <w:rFonts w:asciiTheme="minorHAnsi" w:hAnsiTheme="minorHAnsi" w:cstheme="minorHAnsi"/>
-                <w:sz w:val="22"/>
-              </w:rPr>
-              <w:t>create</w:t>
-            </w:r>
-            <w:r>
-              <w:rPr>
-                <w:rFonts w:asciiTheme="minorHAnsi" w:hAnsiTheme="minorHAnsi" w:cstheme="minorHAnsi"/>
-                <w:sz w:val="22"/>
-              </w:rPr>
-              <w:t>s</w:t>
-            </w:r>
-            <w:r>
-              <w:rPr>
-                <w:rFonts w:asciiTheme="minorHAnsi" w:hAnsiTheme="minorHAnsi" w:cstheme="minorHAnsi"/>
-                <w:sz w:val="22"/>
-              </w:rPr>
-              <w:t xml:space="preserve"> too large of an image for the camera</w:t>
+              <w:t xml:space="preserve"> creates too large of an image for the camera</w:t>
             </w:r>
           </w:p>
           <w:p>
@@ -2752,15 +2235,7 @@
           </w:tcPr>
           <w:p>
             <w:r>
-              <w:t xml:space="preserve">how many times to try an operation before failing (if one </w:t>
-            </w:r>
-            <w:proofErr w:type="gramStart"/>
-            <w:r>
-              <w:t>retry</w:t>
-            </w:r>
-            <w:proofErr w:type="gramEnd"/>
-            <w:r>
-              <w:t xml:space="preserve"> doesn't work, the camera probably needs to be power cycled)</w:t>
+              <w:t>how many times to try an operation before failing (if one retry doesn't work, the camera probably needs to be power cycled)</w:t>
             </w:r>
           </w:p>
         </w:tc>
@@ -2804,13 +2279,7 @@
           </w:tcPr>
           <w:p>
             <w:r>
-              <w:t xml:space="preserve">how many times to cycle power </w:t>
-            </w:r>
-            <w:r>
-              <w:t xml:space="preserve">and retry the transfer </w:t>
-            </w:r>
-            <w:r>
-              <w:t>before failing</w:t>
+              <w:t>how many times to cycle power and retry the transfer before failing</w:t>
             </w:r>
           </w:p>
         </w:tc>
@@ -3019,21 +2488,7 @@
                 <w:rFonts w:asciiTheme="minorHAnsi" w:hAnsiTheme="minorHAnsi" w:cstheme="minorHAnsi"/>
                 <w:sz w:val="22"/>
               </w:rPr>
-              <w:t xml:space="preserve">do not take a picture unless there are 64MB or more </w:t>
-            </w:r>
-            <w:r>
-              <w:rPr>
-                <w:rFonts w:asciiTheme="minorHAnsi" w:hAnsiTheme="minorHAnsi" w:cstheme="minorHAnsi"/>
-                <w:sz w:val="22"/>
-              </w:rPr>
-              <w:t xml:space="preserve">bytes </w:t>
-            </w:r>
-            <w:r>
-              <w:rPr>
-                <w:rFonts w:asciiTheme="minorHAnsi" w:hAnsiTheme="minorHAnsi" w:cstheme="minorHAnsi"/>
-                <w:sz w:val="22"/>
-              </w:rPr>
-              <w:t>free on the SDHC card</w:t>
+              <w:t>do not take a picture unless there are 64MB or more bytes free on the SDHC card</w:t>
             </w:r>
           </w:p>
           <w:p>
@@ -3121,21 +2576,7 @@
                 <w:rFonts w:asciiTheme="minorHAnsi" w:hAnsiTheme="minorHAnsi" w:cstheme="minorHAnsi"/>
                 <w:sz w:val="22"/>
               </w:rPr>
-              <w:t xml:space="preserve">do not archive a picture unless there are 256MB or more </w:t>
-            </w:r>
-            <w:r>
-              <w:rPr>
-                <w:rFonts w:asciiTheme="minorHAnsi" w:hAnsiTheme="minorHAnsi" w:cstheme="minorHAnsi"/>
-                <w:sz w:val="22"/>
-              </w:rPr>
-              <w:t xml:space="preserve">bytes </w:t>
-            </w:r>
-            <w:r>
-              <w:rPr>
-                <w:rFonts w:asciiTheme="minorHAnsi" w:hAnsiTheme="minorHAnsi" w:cstheme="minorHAnsi"/>
-                <w:sz w:val="22"/>
-              </w:rPr>
-              <w:t>free on the SDHC card</w:t>
+              <w:t>do not archive a picture unless there are 256MB or more bytes free on the SDHC card</w:t>
             </w:r>
           </w:p>
           <w:p>
@@ -3278,9 +2719,6 @@
     <w:p>
       <w:pPr>
         <w:ind w:left="720"/>
-        <w:rPr>
-          <w:lang w:val="en-US"/>
-        </w:rPr>
       </w:pPr>
     </w:p>
     <w:p>
@@ -3292,7 +2730,6 @@
           <w:bCs/>
           <w:sz w:val="36"/>
           <w:szCs w:val="36"/>
-          <w:lang w:val="en-US"/>
         </w:rPr>
       </w:pPr>
       <w:r>
@@ -3301,9 +2738,27 @@
           <w:bCs/>
           <w:sz w:val="36"/>
           <w:szCs w:val="36"/>
-          <w:lang w:val="en-US"/>
         </w:rPr>
-        <w:t>Configuring the XLink2-500 to Take Pictures</w:t>
+        <w:lastRenderedPageBreak/>
+        <w:t>Configuring the XLink</w:t>
+      </w:r>
+      <w:r>
+        <w:rPr>
+          <w:b/>
+          <w:bCs/>
+          <w:sz w:val="36"/>
+          <w:szCs w:val="36"/>
+        </w:rPr>
+        <w:t xml:space="preserve"> </w:t>
+      </w:r>
+      <w:r>
+        <w:rPr>
+          <w:b/>
+          <w:bCs/>
+          <w:sz w:val="36"/>
+          <w:szCs w:val="36"/>
+        </w:rPr>
+        <w:t>500 to Take Pictures</w:t>
       </w:r>
     </w:p>
     <w:p>
@@ -3318,7 +2773,10 @@
         </w:rPr>
       </w:pPr>
       <w:r>
-        <w:t xml:space="preserve">insert a FAT32 MicroSD or </w:t>
+        <w:t>I</w:t>
+      </w:r>
+      <w:r>
+        <w:t xml:space="preserve">nsert a FAT32 MicroSD or </w:t>
       </w:r>
       <w:proofErr w:type="spellStart"/>
       <w:r>
@@ -3326,7 +2784,19 @@
       </w:r>
       <w:proofErr w:type="spellEnd"/>
       <w:r>
-        <w:t xml:space="preserve"> card in to the XLink2-500, files and folders will be created as needed. If you are using an SDHC card larger than 32GB, you will probably need to re-format the card (</w:t>
+        <w:t xml:space="preserve"> card in to the </w:t>
+      </w:r>
+      <w:r>
+        <w:t>XLink 500;</w:t>
+      </w:r>
+      <w:r>
+        <w:t xml:space="preserve"> files and folders will be created </w:t>
+      </w:r>
+      <w:r>
+        <w:t xml:space="preserve">automatically </w:t>
+      </w:r>
+      <w:r>
+        <w:t>as needed. If you are using an SDHC card larger than 32GB, you will probably need to re-format the card (</w:t>
       </w:r>
       <w:r>
         <w:rPr>
@@ -3344,13 +2814,7 @@
         <w:rPr>
           <w:szCs w:val="22"/>
         </w:rPr>
-        <w:instrText xml:space="preserve"> REF _Ref43225353 \h </w:instrText>
-      </w:r>
-      <w:r>
-        <w:rPr>
-          <w:szCs w:val="22"/>
-        </w:rPr>
-        <w:instrText xml:space="preserve"> \* MERGEFORMAT </w:instrText>
+        <w:instrText xml:space="preserve"> REF _Ref43225353 \h  \* MERGEFORMAT </w:instrText>
       </w:r>
       <w:r>
         <w:rPr>
@@ -3402,15 +2866,7 @@
         <w:fldChar w:fldCharType="end"/>
       </w:r>
       <w:r>
-        <w:t>). By default, pictures are archived to “</w:t>
-      </w:r>
-      <w:proofErr w:type="spellStart"/>
-      <w:r>
-        <w:t>Sutron</w:t>
-      </w:r>
-      <w:proofErr w:type="spellEnd"/>
-      <w:r>
-        <w:t>\Camera485\&lt;</w:t>
+        <w:t>). By default, pictures are archived to “Sutron\Camera485\&lt;</w:t>
       </w:r>
       <w:proofErr w:type="spellStart"/>
       <w:r>
@@ -3438,15 +2894,7 @@
         </w:numPr>
       </w:pPr>
       <w:r>
-        <w:t xml:space="preserve">Run </w:t>
-      </w:r>
-      <w:proofErr w:type="spellStart"/>
-      <w:r>
-        <w:t>LinkComm</w:t>
-      </w:r>
-      <w:proofErr w:type="spellEnd"/>
-      <w:r>
-        <w:t xml:space="preserve"> (v3.7.9 or later) and connect to the station</w:t>
+        <w:t>Run LinkComm (v3.7.9 or later) and connect to the station</w:t>
       </w:r>
     </w:p>
     <w:p>
@@ -3688,17 +3136,24 @@
                 <w:sz w:val="24"/>
                 <w:szCs w:val="24"/>
               </w:rPr>
-              <w:t xml:space="preserve">Script Task S1 ran 1 </w:t>
-            </w:r>
-            <w:proofErr w:type="gramStart"/>
-            <w:r>
+              <w:t>Script Task S1 ran 1 times</w:t>
+            </w:r>
+          </w:p>
+          <w:p>
+            <w:pPr>
+              <w:jc w:val="left"/>
               <w:rPr>
                 <w:sz w:val="24"/>
                 <w:szCs w:val="24"/>
               </w:rPr>
-              <w:t>times</w:t>
-            </w:r>
-            <w:proofErr w:type="gramEnd"/>
+            </w:pPr>
+            <w:r>
+              <w:rPr>
+                <w:sz w:val="24"/>
+                <w:szCs w:val="24"/>
+              </w:rPr>
+              <w:t>last run result: success</w:t>
+            </w:r>
           </w:p>
           <w:p>
             <w:pPr>
@@ -3713,7 +3168,7 @@
                 <w:sz w:val="24"/>
                 <w:szCs w:val="24"/>
               </w:rPr>
-              <w:t>last run result: success</w:t>
+              <w:t>last run started at 2020/05/13 22:35:01</w:t>
             </w:r>
           </w:p>
           <w:p>
@@ -3729,7 +3184,7 @@
                 <w:sz w:val="24"/>
                 <w:szCs w:val="24"/>
               </w:rPr>
-              <w:t>last run started at 2020/05/13 22:35:01</w:t>
+              <w:t>last run completed at 2020/05/13 22:35:27</w:t>
             </w:r>
           </w:p>
           <w:p>
@@ -3745,7 +3200,15 @@
                 <w:sz w:val="24"/>
                 <w:szCs w:val="24"/>
               </w:rPr>
-              <w:t>last run completed at 2020/05/13 22:35:27</w:t>
+              <w:t>Script Function: Take</w:t>
+            </w:r>
+            <w:r>
+              <w:rPr>
+                <w:sz w:val="24"/>
+                <w:szCs w:val="24"/>
+              </w:rPr>
+              <w:softHyphen/>
+              <w:t>_1280x720_MediumDetail</w:t>
             </w:r>
           </w:p>
           <w:p>
@@ -3756,20 +3219,21 @@
                 <w:szCs w:val="24"/>
               </w:rPr>
             </w:pPr>
-            <w:r>
+          </w:p>
+          <w:p>
+            <w:pPr>
+              <w:jc w:val="left"/>
               <w:rPr>
                 <w:sz w:val="24"/>
                 <w:szCs w:val="24"/>
               </w:rPr>
-              <w:t>Script Function: Take</w:t>
-            </w:r>
+            </w:pPr>
             <w:r>
               <w:rPr>
                 <w:sz w:val="24"/>
                 <w:szCs w:val="24"/>
               </w:rPr>
-              <w:softHyphen/>
-              <w:t>_1280x720_MediumDetail</w:t>
+              <w:t>Output:</w:t>
             </w:r>
           </w:p>
           <w:p>
@@ -3780,6 +3244,13 @@
                 <w:szCs w:val="24"/>
               </w:rPr>
             </w:pPr>
+            <w:r>
+              <w:rPr>
+                <w:sz w:val="24"/>
+                <w:szCs w:val="24"/>
+              </w:rPr>
+              <w:t>Updated the camera's overlay</w:t>
+            </w:r>
           </w:p>
           <w:p>
             <w:pPr>
@@ -3794,71 +3265,24 @@
                 <w:sz w:val="24"/>
                 <w:szCs w:val="24"/>
               </w:rPr>
-              <w:t>Output:</w:t>
-            </w:r>
-          </w:p>
-          <w:p>
-            <w:pPr>
-              <w:jc w:val="left"/>
+              <w:lastRenderedPageBreak/>
+              <w:t>Camera imaged stored to /</w:t>
+            </w:r>
+            <w:proofErr w:type="spellStart"/>
+            <w:r>
               <w:rPr>
                 <w:sz w:val="24"/>
                 <w:szCs w:val="24"/>
               </w:rPr>
-            </w:pPr>
+              <w:t>sd</w:t>
+            </w:r>
+            <w:proofErr w:type="spellEnd"/>
             <w:r>
               <w:rPr>
                 <w:sz w:val="24"/>
                 <w:szCs w:val="24"/>
               </w:rPr>
-              <w:t>Updated the camera's overlay</w:t>
-            </w:r>
-          </w:p>
-          <w:p>
-            <w:pPr>
-              <w:jc w:val="left"/>
-              <w:rPr>
-                <w:sz w:val="24"/>
-                <w:szCs w:val="24"/>
-              </w:rPr>
-            </w:pPr>
-            <w:r>
-              <w:rPr>
-                <w:sz w:val="24"/>
-                <w:szCs w:val="24"/>
-              </w:rPr>
-              <w:t>Camera imaged stored to /</w:t>
-            </w:r>
-            <w:proofErr w:type="spellStart"/>
-            <w:r>
-              <w:rPr>
-                <w:sz w:val="24"/>
-                <w:szCs w:val="24"/>
-              </w:rPr>
-              <w:t>sd</w:t>
-            </w:r>
-            <w:proofErr w:type="spellEnd"/>
-            <w:r>
-              <w:rPr>
-                <w:sz w:val="24"/>
-                <w:szCs w:val="24"/>
-              </w:rPr>
-              <w:t>/</w:t>
-            </w:r>
-            <w:proofErr w:type="spellStart"/>
-            <w:r>
-              <w:rPr>
-                <w:sz w:val="24"/>
-                <w:szCs w:val="24"/>
-              </w:rPr>
-              <w:t>Sutron</w:t>
-            </w:r>
-            <w:proofErr w:type="spellEnd"/>
-            <w:r>
-              <w:rPr>
-                <w:sz w:val="24"/>
-                <w:szCs w:val="24"/>
-              </w:rPr>
-              <w:t>/Camera485/20200513/Camera485_200513223501.jpg 150096 bytes</w:t>
+              <w:t>/Sutron/Camera485/20200513/Camera485_200513223501.jpg 150096 bytes</w:t>
             </w:r>
           </w:p>
           <w:p>
@@ -4094,15 +3518,7 @@
               <w:jc w:val="left"/>
             </w:pPr>
             <w:r>
-              <w:t xml:space="preserve">x is the number of times the camera needed to be re-powered </w:t>
-            </w:r>
-            <w:proofErr w:type="gramStart"/>
-            <w:r>
-              <w:t>in order to</w:t>
-            </w:r>
-            <w:proofErr w:type="gramEnd"/>
-            <w:r>
-              <w:t xml:space="preserve"> take a picture and should be low relative to the total number of pictures</w:t>
+              <w:t>x is the number of times the camera needed to be re-powered in order to take a picture and should be low relative to the total number of pictures</w:t>
             </w:r>
           </w:p>
         </w:tc>
@@ -4244,7 +3660,6 @@
           <w:bCs/>
           <w:sz w:val="36"/>
           <w:szCs w:val="36"/>
-          <w:lang w:val="en-US"/>
         </w:rPr>
       </w:pPr>
       <w:r>
@@ -4253,7 +3668,6 @@
           <w:bCs/>
           <w:sz w:val="36"/>
           <w:szCs w:val="36"/>
-          <w:lang w:val="en-US"/>
         </w:rPr>
         <w:t>Configuring the Cell Modem</w:t>
       </w:r>
@@ -4263,27 +3677,7 @@
         <w:ind w:left="720"/>
       </w:pPr>
       <w:r>
-        <w:rPr>
-          <w:lang w:val="en-US"/>
-        </w:rPr>
-        <w:t xml:space="preserve">The Cell Modem is configured under “Other Setup” tab in </w:t>
-      </w:r>
-      <w:proofErr w:type="spellStart"/>
-      <w:r>
-        <w:rPr>
-          <w:lang w:val="en-US"/>
-        </w:rPr>
-        <w:t>LinkComm</w:t>
-      </w:r>
-      <w:proofErr w:type="spellEnd"/>
-      <w:r>
-        <w:rPr>
-          <w:lang w:val="en-US"/>
-        </w:rPr>
-        <w:t xml:space="preserve"> in the Cell section. </w:t>
-      </w:r>
-      <w:r>
-        <w:t>You minimally need to do the following:</w:t>
+        <w:t>The Cell Modem is configured under “Other Setup” tab in LinkComm in the Cell section. You minimally need to do the following:</w:t>
       </w:r>
     </w:p>
     <w:p>
@@ -4335,79 +3729,31 @@
     <w:p>
       <w:pPr>
         <w:ind w:left="720"/>
-        <w:rPr>
-          <w:lang w:val="en-US"/>
-        </w:rPr>
-      </w:pPr>
-      <w:r>
-        <w:rPr>
-          <w:lang w:val="en-US"/>
-        </w:rPr>
-        <w:t xml:space="preserve">In addition, if you enable incoming connections it’s recommended that you do so in combination with security features such as “Whitelist IPs” and “Cell </w:t>
-      </w:r>
-      <w:proofErr w:type="gramStart"/>
-      <w:r>
-        <w:rPr>
-          <w:lang w:val="en-US"/>
-        </w:rPr>
-        <w:t>user name</w:t>
-      </w:r>
-      <w:proofErr w:type="gramEnd"/>
-      <w:r>
-        <w:rPr>
-          <w:lang w:val="en-US"/>
-        </w:rPr>
-        <w:t>” and “Cell password” under the “Modem settings”</w:t>
+      </w:pPr>
+      <w:r>
+        <w:t>In addition, if you enable incoming connections it’s recommended that you do so in combination with security features such as “Whitelist IPs” and “Cell user name” and “Cell password” under the “Modem settings”</w:t>
       </w:r>
     </w:p>
     <w:p>
       <w:pPr>
         <w:ind w:left="720"/>
-        <w:rPr>
-          <w:lang w:val="en-US"/>
-        </w:rPr>
-      </w:pPr>
-      <w:r>
-        <w:rPr>
-          <w:lang w:val="en-US"/>
-        </w:rPr>
+      </w:pPr>
+      <w:r>
+        <w:lastRenderedPageBreak/>
         <w:t xml:space="preserve">When the Cell is configured, press the “Cell </w:t>
       </w:r>
       <w:proofErr w:type="spellStart"/>
       <w:r>
-        <w:rPr>
-          <w:lang w:val="en-US"/>
-        </w:rPr>
         <w:t>Diags</w:t>
       </w:r>
       <w:proofErr w:type="spellEnd"/>
       <w:r>
-        <w:rPr>
-          <w:lang w:val="en-US"/>
-        </w:rPr>
-        <w:t xml:space="preserve">…” button and confirm that station </w:t>
-      </w:r>
-      <w:proofErr w:type="gramStart"/>
-      <w:r>
-        <w:rPr>
-          <w:lang w:val="en-US"/>
-        </w:rPr>
-        <w:t>is able to</w:t>
-      </w:r>
-      <w:proofErr w:type="gramEnd"/>
-      <w:r>
-        <w:rPr>
-          <w:lang w:val="en-US"/>
-        </w:rPr>
-        <w:t xml:space="preserve"> get Online and everything looks ok. Note the phone number and IP address is displayed here.</w:t>
+        <w:t>…” button and confirm that station is able to get Online and everything looks ok. Note the phone number and IP address is displayed here.</w:t>
       </w:r>
     </w:p>
     <w:p>
       <w:pPr>
         <w:ind w:left="720"/>
-        <w:rPr>
-          <w:lang w:val="en-US"/>
-        </w:rPr>
       </w:pPr>
     </w:p>
     <w:p>
@@ -4418,7 +3764,6 @@
           <w:bCs/>
           <w:sz w:val="36"/>
           <w:szCs w:val="36"/>
-          <w:lang w:val="en-US"/>
         </w:rPr>
       </w:pPr>
       <w:r>
@@ -4427,74 +3772,76 @@
           <w:bCs/>
           <w:sz w:val="36"/>
           <w:szCs w:val="36"/>
-          <w:lang w:val="en-US"/>
         </w:rPr>
-        <w:t>Configuring the XLink2-500 to FTP Files Over Cell</w:t>
+        <w:t xml:space="preserve">Configuring the </w:t>
+      </w:r>
+      <w:r>
+        <w:rPr>
+          <w:b/>
+          <w:bCs/>
+          <w:sz w:val="36"/>
+          <w:szCs w:val="36"/>
+        </w:rPr>
+        <w:t>XLink 500</w:t>
+      </w:r>
+      <w:r>
+        <w:rPr>
+          <w:b/>
+          <w:bCs/>
+          <w:sz w:val="36"/>
+          <w:szCs w:val="36"/>
+        </w:rPr>
+        <w:t xml:space="preserve"> to </w:t>
+      </w:r>
+      <w:r>
+        <w:rPr>
+          <w:b/>
+          <w:bCs/>
+          <w:sz w:val="36"/>
+          <w:szCs w:val="36"/>
+        </w:rPr>
+        <w:t>Transmit</w:t>
+      </w:r>
+      <w:r>
+        <w:rPr>
+          <w:b/>
+          <w:bCs/>
+          <w:sz w:val="36"/>
+          <w:szCs w:val="36"/>
+        </w:rPr>
+        <w:t xml:space="preserve"> Files Over Cell</w:t>
       </w:r>
     </w:p>
     <w:p>
       <w:pPr>
         <w:ind w:left="720"/>
-        <w:rPr>
-          <w:lang w:val="en-US"/>
-        </w:rPr>
       </w:pPr>
       <w:r>
         <w:rPr>
           <w:b/>
           <w:bCs/>
           <w:color w:val="FF0000"/>
-          <w:lang w:val="en-US"/>
         </w:rPr>
         <w:t>Warning!</w:t>
       </w:r>
       <w:r>
-        <w:rPr>
-          <w:lang w:val="en-US"/>
-        </w:rPr>
         <w:t xml:space="preserve"> Make sure your Cell data plan is sufficient for transferring camera images. A 1280x720 (720P) picture with compression 3 can be 200KBytes and would consume 9 </w:t>
       </w:r>
       <w:proofErr w:type="spellStart"/>
       <w:r>
-        <w:rPr>
-          <w:lang w:val="en-US"/>
-        </w:rPr>
         <w:t>GBytes</w:t>
       </w:r>
       <w:proofErr w:type="spellEnd"/>
       <w:r>
-        <w:rPr>
-          <w:lang w:val="en-US"/>
-        </w:rPr>
         <w:t xml:space="preserve"> per month if 200KB was transmitted every minute.</w:t>
       </w:r>
     </w:p>
     <w:p>
       <w:pPr>
         <w:ind w:left="720"/>
-        <w:rPr>
-          <w:lang w:val="en-US"/>
-        </w:rPr>
-      </w:pPr>
-      <w:r>
-        <w:rPr>
-          <w:lang w:val="en-US"/>
-        </w:rPr>
-        <w:t xml:space="preserve">You will need an FTP Server and the login credentials for the FTP server </w:t>
-      </w:r>
-      <w:proofErr w:type="gramStart"/>
-      <w:r>
-        <w:rPr>
-          <w:lang w:val="en-US"/>
-        </w:rPr>
-        <w:t>in order to</w:t>
-      </w:r>
-      <w:proofErr w:type="gramEnd"/>
-      <w:r>
-        <w:rPr>
-          <w:lang w:val="en-US"/>
-        </w:rPr>
-        <w:t xml:space="preserve"> proceed.</w:t>
+      </w:pPr>
+      <w:r>
+        <w:t>You will need an FTP Server and the login credentials for the FTP server in order to proceed.</w:t>
       </w:r>
     </w:p>
     <w:p>
@@ -4506,15 +3853,7 @@
         </w:numPr>
       </w:pPr>
       <w:r>
-        <w:t xml:space="preserve">Run </w:t>
-      </w:r>
-      <w:proofErr w:type="spellStart"/>
-      <w:r>
-        <w:t>LinkComm</w:t>
-      </w:r>
-      <w:proofErr w:type="spellEnd"/>
-      <w:r>
-        <w:t xml:space="preserve"> (v3.7.9 or later) and connect to the station</w:t>
+        <w:t>Run LinkComm (v3.7.9 or later) and connect to the station</w:t>
       </w:r>
     </w:p>
     <w:p>
@@ -4526,13 +3865,8 @@
         </w:numPr>
       </w:pPr>
       <w:r>
-        <w:t xml:space="preserve">Click the “Telemetry” tab in </w:t>
-      </w:r>
-      <w:proofErr w:type="spellStart"/>
-      <w:r>
-        <w:t>LinkComm</w:t>
-      </w:r>
-      <w:proofErr w:type="spellEnd"/>
+        <w:t>Click the “Telemetry” tab in LinkComm</w:t>
+      </w:r>
     </w:p>
     <w:p>
       <w:pPr>
@@ -4647,6 +3981,9 @@
       <w:r>
         <w:t>Change the “Tx mode” to “FTP”</w:t>
       </w:r>
+      <w:r>
+        <w:t>, “MQTT”, “HTTP”, or “TCP/IP”</w:t>
+      </w:r>
     </w:p>
     <w:p>
       <w:pPr>
@@ -4657,83 +3994,7 @@
         </w:numPr>
       </w:pPr>
       <w:r>
-        <w:t>Check “Secure” if your FTP server supports FTPS</w:t>
-      </w:r>
-    </w:p>
-    <w:p>
-      <w:pPr>
-        <w:pStyle w:val="ListParagraph"/>
-        <w:numPr>
-          <w:ilvl w:val="1"/>
-          <w:numId w:val="3"/>
-        </w:numPr>
-      </w:pPr>
-      <w:r>
-        <w:t>Change the “FTP Path” to “/TX1”</w:t>
-      </w:r>
-    </w:p>
-    <w:p>
-      <w:pPr>
-        <w:pStyle w:val="ListParagraph"/>
-        <w:numPr>
-          <w:ilvl w:val="1"/>
-          <w:numId w:val="3"/>
-        </w:numPr>
-      </w:pPr>
-      <w:r>
-        <w:t>Change the “Main sever” to the URL or IP address of your FTP server</w:t>
-      </w:r>
-    </w:p>
-    <w:p>
-      <w:pPr>
-        <w:pStyle w:val="ListParagraph"/>
-        <w:numPr>
-          <w:ilvl w:val="1"/>
-          <w:numId w:val="3"/>
-        </w:numPr>
-      </w:pPr>
-      <w:r>
-        <w:t xml:space="preserve">Change the “Server username” to your </w:t>
-      </w:r>
-      <w:proofErr w:type="gramStart"/>
-      <w:r>
-        <w:t>user name</w:t>
-      </w:r>
-      <w:proofErr w:type="gramEnd"/>
-      <w:r>
-        <w:t xml:space="preserve"> for your FTP Server</w:t>
-      </w:r>
-    </w:p>
-    <w:p>
-      <w:pPr>
-        <w:pStyle w:val="ListParagraph"/>
-        <w:numPr>
-          <w:ilvl w:val="1"/>
-          <w:numId w:val="3"/>
-        </w:numPr>
-      </w:pPr>
-      <w:r>
-        <w:t xml:space="preserve">Change the “Server password” to your </w:t>
-      </w:r>
-      <w:proofErr w:type="gramStart"/>
-      <w:r>
-        <w:t>user name</w:t>
-      </w:r>
-      <w:proofErr w:type="gramEnd"/>
-      <w:r>
-        <w:t xml:space="preserve"> for your FTP Server</w:t>
-      </w:r>
-    </w:p>
-    <w:p>
-      <w:pPr>
-        <w:pStyle w:val="ListParagraph"/>
-        <w:numPr>
-          <w:ilvl w:val="1"/>
-          <w:numId w:val="3"/>
-        </w:numPr>
-      </w:pPr>
-      <w:r>
-        <w:t>Verify the “FTP mode” is set to Passive unless you know your server requires Active</w:t>
+        <w:t>Please see the XLink user manual for details on how to setup telemetry, and the details of how files are transferred.</w:t>
       </w:r>
     </w:p>
     <w:p>
@@ -4828,51 +4089,28 @@
         <w:t>C</w:t>
       </w:r>
       <w:r>
-        <w:t xml:space="preserve">lick </w:t>
-      </w:r>
-      <w:proofErr w:type="gramStart"/>
-      <w:r>
-        <w:t>“!Changed</w:t>
-      </w:r>
-      <w:proofErr w:type="gramEnd"/>
-      <w:r>
-        <w:t>” and “Send Setup to Station”</w:t>
+        <w:t>lick “!Changed” and “Send Setup to Station”</w:t>
       </w:r>
     </w:p>
     <w:p>
       <w:pPr>
         <w:ind w:left="720"/>
-        <w:rPr>
-          <w:lang w:val="en-US"/>
-        </w:rPr>
-      </w:pPr>
-      <w:r>
-        <w:rPr>
-          <w:lang w:val="en-US"/>
-        </w:rPr>
+      </w:pPr>
+      <w:r>
         <w:t>Once the camera is taking pictures, the Cell is configured, and transmissions are setup, the final step is to make sure transmissions are going through. Press “Refresh” next to the “Telemetry Status” and if possible, wait until the next transmission and verify that the “Tx succeeded” count goes up. Alternatively, you can manually run the “</w:t>
       </w:r>
       <w:proofErr w:type="spellStart"/>
       <w:r>
-        <w:rPr>
-          <w:lang w:val="en-US"/>
-        </w:rPr>
         <w:t>TakePicture</w:t>
       </w:r>
       <w:proofErr w:type="spellEnd"/>
       <w:r>
-        <w:rPr>
-          <w:lang w:val="en-US"/>
-        </w:rPr>
         <w:t>” script using the “Run Script Now…” button under the “Scripts” tab in the “S1” setup, and then go back to “Telemetry” “TX1” setup and click the “Transmit Now” button.</w:t>
       </w:r>
     </w:p>
     <w:p>
       <w:pPr>
         <w:ind w:left="720"/>
-        <w:rPr>
-          <w:lang w:val="en-US"/>
-        </w:rPr>
       </w:pPr>
     </w:p>
     <w:p>
@@ -4883,7 +4121,6 @@
           <w:bCs/>
           <w:sz w:val="36"/>
           <w:szCs w:val="36"/>
-          <w:lang w:val="en-US"/>
         </w:rPr>
       </w:pPr>
       <w:r>
@@ -4892,7 +4129,6 @@
           <w:bCs/>
           <w:sz w:val="36"/>
           <w:szCs w:val="36"/>
-          <w:lang w:val="en-US"/>
         </w:rPr>
         <w:t>Logging and Transmitting Free Space on the SDHC card</w:t>
       </w:r>
@@ -4900,57 +4136,29 @@
     <w:p>
       <w:pPr>
         <w:ind w:left="360"/>
-        <w:rPr>
-          <w:lang w:val="en-US"/>
-        </w:rPr>
-      </w:pPr>
-      <w:r>
-        <w:rPr>
-          <w:lang w:val="en-US"/>
-        </w:rPr>
+      </w:pPr>
+      <w:r>
         <w:t>A script called “</w:t>
       </w:r>
       <w:proofErr w:type="spellStart"/>
       <w:r>
-        <w:rPr>
-          <w:lang w:val="en-US"/>
-        </w:rPr>
         <w:t>Free_Space_MB</w:t>
       </w:r>
       <w:proofErr w:type="spellEnd"/>
       <w:r>
-        <w:rPr>
-          <w:lang w:val="en-US"/>
-        </w:rPr>
-        <w:t>” permits the number of mega-bytes of free space on the SDHC card to be measure, logged, and/or transmitted. If an SDHC card is not inserted or could not be mounted the function returns a script error resulting in a bad value being logged (default is -99999.0).</w:t>
+        <w:t xml:space="preserve">” permits the number of mega-bytes of free space on the SDHC card to be measure, logged, and/or transmitted. If an SDHC card is not inserted or </w:t>
+      </w:r>
+      <w:r>
+        <w:lastRenderedPageBreak/>
+        <w:t>could not be mounted the function returns a script error resulting in a bad value being logged (default is -99999.0).</w:t>
       </w:r>
     </w:p>
     <w:p>
       <w:pPr>
         <w:ind w:left="360"/>
-        <w:rPr>
-          <w:lang w:val="en-US"/>
-        </w:rPr>
-      </w:pPr>
-      <w:r>
-        <w:rPr>
-          <w:lang w:val="en-US"/>
-        </w:rPr>
-        <w:t xml:space="preserve">To setup a measurement using </w:t>
-      </w:r>
-      <w:proofErr w:type="spellStart"/>
-      <w:r>
-        <w:rPr>
-          <w:lang w:val="en-US"/>
-        </w:rPr>
-        <w:t>LinkComm</w:t>
-      </w:r>
-      <w:proofErr w:type="spellEnd"/>
-      <w:r>
-        <w:rPr>
-          <w:lang w:val="en-US"/>
-        </w:rPr>
-        <w:t>:</w:t>
+      </w:pPr>
+      <w:r>
+        <w:t>To setup a measurement using LinkComm:</w:t>
       </w:r>
     </w:p>
     <w:p>
@@ -4962,15 +4170,7 @@
         </w:numPr>
       </w:pPr>
       <w:r>
-        <w:t xml:space="preserve">Run </w:t>
-      </w:r>
-      <w:proofErr w:type="spellStart"/>
-      <w:r>
-        <w:t>LinkComm</w:t>
-      </w:r>
-      <w:proofErr w:type="spellEnd"/>
-      <w:r>
-        <w:t xml:space="preserve"> (v3.7.9 or later) and connect to the station</w:t>
+        <w:t>Run LinkComm (v3.7.9 or later) and connect to the station</w:t>
       </w:r>
     </w:p>
     <w:p>
@@ -4982,13 +4182,8 @@
         </w:numPr>
       </w:pPr>
       <w:r>
-        <w:t xml:space="preserve">Click the “Measurements” tab in </w:t>
-      </w:r>
-      <w:proofErr w:type="spellStart"/>
-      <w:r>
-        <w:t>LinkComm</w:t>
-      </w:r>
-      <w:proofErr w:type="spellEnd"/>
+        <w:t>Click the “Measurements” tab in LinkComm</w:t>
+      </w:r>
     </w:p>
     <w:p>
       <w:pPr>
@@ -5225,23 +4420,14 @@
     <w:p>
       <w:pPr>
         <w:ind w:left="360"/>
-        <w:rPr>
-          <w:lang w:val="en-US"/>
-        </w:rPr>
-      </w:pPr>
-      <w:r>
-        <w:rPr>
-          <w:lang w:val="en-US"/>
-        </w:rPr>
+      </w:pPr>
+      <w:r>
         <w:t>To transmit the data, you will need to configure a “Telemetry” entry to send the data, and then you can select this in the measurement setup under the “Tx Content” section.</w:t>
       </w:r>
     </w:p>
     <w:p>
       <w:pPr>
         <w:ind w:left="360"/>
-        <w:rPr>
-          <w:lang w:val="en-US"/>
-        </w:rPr>
       </w:pPr>
     </w:p>
     <w:p>
@@ -5252,7 +4438,6 @@
           <w:bCs/>
           <w:sz w:val="36"/>
           <w:szCs w:val="36"/>
-          <w:lang w:val="en-US"/>
         </w:rPr>
       </w:pPr>
       <w:r>
@@ -5261,7 +4446,6 @@
           <w:bCs/>
           <w:sz w:val="36"/>
           <w:szCs w:val="36"/>
-          <w:lang w:val="en-US"/>
         </w:rPr>
         <w:t>Final Considerations</w:t>
       </w:r>
@@ -5276,7 +4460,6 @@
           <w:bCs/>
           <w:sz w:val="28"/>
           <w:szCs w:val="28"/>
-          <w:lang w:val="en-US"/>
         </w:rPr>
       </w:pPr>
       <w:r>
@@ -5285,7 +4468,6 @@
           <w:bCs/>
           <w:sz w:val="28"/>
           <w:szCs w:val="28"/>
-          <w:lang w:val="en-US"/>
         </w:rPr>
         <w:t>Removing or Replacing the SDHC Card</w:t>
       </w:r>
@@ -5293,56 +4475,30 @@
     <w:p>
       <w:pPr>
         <w:ind w:left="720"/>
-        <w:rPr>
-          <w:lang w:val="en-US"/>
-        </w:rPr>
-      </w:pPr>
-      <w:r>
-        <w:rPr>
-          <w:lang w:val="en-US"/>
-        </w:rPr>
-        <w:t xml:space="preserve">The safest way to remove the SDHC card from the XLink-500 is to dismount it using the “file dismount </w:t>
+      </w:pPr>
+      <w:r>
+        <w:t>The safest way to remove the SDHC card from the XLink</w:t>
+      </w:r>
+      <w:r>
+        <w:t xml:space="preserve"> </w:t>
+      </w:r>
+      <w:r>
+        <w:t xml:space="preserve">500 is to dismount it using the “file dismount </w:t>
       </w:r>
       <w:proofErr w:type="spellStart"/>
       <w:r>
-        <w:rPr>
-          <w:lang w:val="en-US"/>
-        </w:rPr>
         <w:t>sd</w:t>
       </w:r>
       <w:proofErr w:type="spellEnd"/>
       <w:r>
-        <w:rPr>
-          <w:lang w:val="en-US"/>
-        </w:rPr>
-        <w:t xml:space="preserve">” command from the command prompt. Using </w:t>
-      </w:r>
-      <w:proofErr w:type="spellStart"/>
-      <w:r>
-        <w:rPr>
-          <w:lang w:val="en-US"/>
-        </w:rPr>
-        <w:t>LinkComm</w:t>
-      </w:r>
-      <w:proofErr w:type="spellEnd"/>
-      <w:r>
-        <w:rPr>
-          <w:lang w:val="en-US"/>
-        </w:rPr>
-        <w:t>, the command prompt may be accessed by pressing the Terminal button in the Diagnostics tab.</w:t>
+        <w:t>” command from the command prompt. Using LinkComm, the command prompt may be accessed by pressing the Terminal button in the Diagnostics tab.</w:t>
       </w:r>
     </w:p>
     <w:p>
       <w:pPr>
         <w:ind w:left="720"/>
-        <w:rPr>
-          <w:lang w:val="en-US"/>
-        </w:rPr>
-      </w:pPr>
-      <w:r>
-        <w:rPr>
-          <w:lang w:val="en-US"/>
-        </w:rPr>
+      </w:pPr>
+      <w:r>
         <w:t>Here’s some other ways, that are not quite as effective due to the potential for background writes going on:</w:t>
       </w:r>
     </w:p>
@@ -5393,37 +4549,23 @@
     <w:p>
       <w:pPr>
         <w:ind w:left="720"/>
-        <w:rPr>
-          <w:lang w:val="en-US"/>
-        </w:rPr>
-      </w:pPr>
-      <w:r>
-        <w:rPr>
-          <w:lang w:val="en-US"/>
-        </w:rPr>
+      </w:pPr>
+      <w:r>
+        <w:lastRenderedPageBreak/>
         <w:t>If you can just pull the card without taking any precautions, there’s a slight chance the file structure on the card could become damaged. In most cases, this can be repaired by putting the card in a PC and when prompted letting the PC repair the disk.</w:t>
       </w:r>
     </w:p>
     <w:p>
       <w:pPr>
         <w:ind w:left="720"/>
-        <w:rPr>
-          <w:lang w:val="en-US"/>
-        </w:rPr>
-      </w:pPr>
-      <w:r>
-        <w:rPr>
-          <w:lang w:val="en-US"/>
-        </w:rPr>
+      </w:pPr>
+      <w:r>
         <w:t>Interrupting a picture in progress can result in a partial image being stored on the card – this image may even be viewable, but part of the image will be missing.</w:t>
       </w:r>
     </w:p>
     <w:p>
       <w:pPr>
         <w:ind w:left="720"/>
-        <w:rPr>
-          <w:lang w:val="en-US"/>
-        </w:rPr>
       </w:pPr>
     </w:p>
     <w:p>
@@ -5436,7 +4578,6 @@
           <w:bCs/>
           <w:sz w:val="28"/>
           <w:szCs w:val="28"/>
-          <w:lang w:val="en-US"/>
         </w:rPr>
       </w:pPr>
       <w:r>
@@ -5445,7 +4586,6 @@
           <w:bCs/>
           <w:sz w:val="28"/>
           <w:szCs w:val="28"/>
-          <w:lang w:val="en-US"/>
         </w:rPr>
         <w:t xml:space="preserve">Choosing a MicroSD or </w:t>
       </w:r>
@@ -5456,7 +4596,6 @@
           <w:bCs/>
           <w:sz w:val="28"/>
           <w:szCs w:val="28"/>
-          <w:lang w:val="en-US"/>
         </w:rPr>
         <w:t>MicroSDHC</w:t>
       </w:r>
@@ -5467,7 +4606,6 @@
           <w:bCs/>
           <w:sz w:val="28"/>
           <w:szCs w:val="28"/>
-          <w:lang w:val="en-US"/>
         </w:rPr>
         <w:t xml:space="preserve"> card</w:t>
       </w:r>
@@ -5475,115 +4613,59 @@
     <w:p>
       <w:pPr>
         <w:ind w:left="720"/>
-        <w:rPr>
-          <w:lang w:val="en-US"/>
-        </w:rPr>
-      </w:pPr>
-      <w:r>
-        <w:rPr>
-          <w:lang w:val="en-US"/>
-        </w:rPr>
+      </w:pPr>
+      <w:r>
         <w:t xml:space="preserve">We have tested in house with commercial </w:t>
       </w:r>
       <w:proofErr w:type="spellStart"/>
       <w:r>
-        <w:rPr>
-          <w:lang w:val="en-US"/>
-        </w:rPr>
         <w:t>MicroSDHC</w:t>
       </w:r>
       <w:proofErr w:type="spellEnd"/>
       <w:r>
-        <w:rPr>
-          <w:lang w:val="en-US"/>
-        </w:rPr>
         <w:t xml:space="preserve"> cards as large as 256GB. Given the data logger will be exposed to temperature extremes, though, we recommend using cards designed for those extremes. For the highest possible reliability, we recommend industrial cards with fault tolerance such as the </w:t>
       </w:r>
       <w:proofErr w:type="spellStart"/>
       <w:r>
-        <w:rPr>
-          <w:lang w:val="en-US"/>
-        </w:rPr>
         <w:t>Swissbit</w:t>
       </w:r>
       <w:proofErr w:type="spellEnd"/>
       <w:r>
-        <w:rPr>
-          <w:lang w:val="en-US"/>
-        </w:rPr>
         <w:t xml:space="preserve"> S-455 line. These cards tend to be more expensive and may not be available in larger sizes. Some other brands which offer a line with fault tolerance and industrial temperature range include Panasonic, </w:t>
       </w:r>
       <w:proofErr w:type="spellStart"/>
       <w:r>
-        <w:rPr>
-          <w:lang w:val="en-US"/>
-        </w:rPr>
         <w:t>Delkin</w:t>
       </w:r>
       <w:proofErr w:type="spellEnd"/>
       <w:r>
-        <w:rPr>
-          <w:lang w:val="en-US"/>
-        </w:rPr>
-        <w:t xml:space="preserve">, and Transcend.  Most of these cards cost over $100 for an 8GB card as they often use the more expensive SLC-based </w:t>
+        <w:t xml:space="preserve">, and Transcend.  Most of these cards cost over $100 for an 8GB card as they often use the more expensive SLC-based Nand chips. A more reasonably price option is the Kingston Industrial </w:t>
       </w:r>
       <w:proofErr w:type="spellStart"/>
       <w:r>
-        <w:rPr>
-          <w:lang w:val="en-US"/>
-        </w:rPr>
-        <w:t>Nand</w:t>
+        <w:t>MicroSDHC</w:t>
       </w:r>
       <w:proofErr w:type="spellEnd"/>
       <w:r>
-        <w:rPr>
-          <w:lang w:val="en-US"/>
-        </w:rPr>
-        <w:t xml:space="preserve"> chips. A more reasonably price option is the Kingston Industrial </w:t>
-      </w:r>
+        <w:t xml:space="preserve"> card, which is designed to be reliable, rugged, and operate down to -40C; but lacks the failsafe features of the more expensive cards. We’ve also tested with standard commercial cards which are often rated down to -20C, but they are not specifically designed for permanent installation in outdoor equipment. </w:t>
+      </w:r>
+    </w:p>
+    <w:p>
+      <w:pPr>
+        <w:ind w:left="720"/>
+      </w:pPr>
       <w:proofErr w:type="spellStart"/>
       <w:r>
-        <w:rPr>
-          <w:lang w:val="en-US"/>
-        </w:rPr>
         <w:t>MicroSDHC</w:t>
       </w:r>
       <w:proofErr w:type="spellEnd"/>
       <w:r>
-        <w:rPr>
-          <w:lang w:val="en-US"/>
-        </w:rPr>
-        <w:t xml:space="preserve"> card, which is designed to be reliable, rugged, and operate down to -40C; but lacks the failsafe features of the more expensive cards. We’ve also tested with standard commercial cards which are often rated down to -20C, but they are not specifically designed for permanent installation in outdoor equipment. </w:t>
+        <w:t xml:space="preserve"> cards are often marked with speed/compatibility ratings such as class 10, UHS-1, SDXC, etc. We have not seen any compatibility issues, as the newer standards seem to be sufficiently backwards compatible. The “file test” command may be used to perform a simple benchmark of the card performance. </w:t>
       </w:r>
     </w:p>
     <w:p>
       <w:pPr>
         <w:ind w:left="720"/>
-        <w:rPr>
-          <w:lang w:val="en-US"/>
-        </w:rPr>
-      </w:pPr>
-      <w:proofErr w:type="spellStart"/>
-      <w:r>
-        <w:rPr>
-          <w:lang w:val="en-US"/>
-        </w:rPr>
-        <w:t>MicroSDHC</w:t>
-      </w:r>
-      <w:proofErr w:type="spellEnd"/>
-      <w:r>
-        <w:rPr>
-          <w:lang w:val="en-US"/>
-        </w:rPr>
-        <w:t xml:space="preserve"> cards are often marked with speed/compatibility ratings such as class 10, UHS-1, SDXC, etc. We have not seen any compatibility issues, as the newer standards seem to be sufficiently backwards compatible. The “file test” command may be used to perform a simple benchmark of the card performance. </w:t>
-      </w:r>
-    </w:p>
-    <w:p>
-      <w:pPr>
-        <w:ind w:left="720"/>
-        <w:rPr>
-          <w:lang w:val="en-US"/>
-        </w:rPr>
       </w:pPr>
     </w:p>
     <w:p>
@@ -5596,7 +4678,6 @@
           <w:bCs/>
           <w:sz w:val="28"/>
           <w:szCs w:val="28"/>
-          <w:lang w:val="en-US"/>
         </w:rPr>
       </w:pPr>
       <w:r>
@@ -5605,7 +4686,6 @@
           <w:bCs/>
           <w:sz w:val="28"/>
           <w:szCs w:val="28"/>
-          <w:lang w:val="en-US"/>
         </w:rPr>
         <w:t>Surge Protection</w:t>
       </w:r>
@@ -5613,23 +4693,14 @@
     <w:p>
       <w:pPr>
         <w:ind w:left="720"/>
-        <w:rPr>
-          <w:lang w:val="en-US"/>
-        </w:rPr>
-      </w:pPr>
-      <w:r>
-        <w:rPr>
-          <w:lang w:val="en-US"/>
-        </w:rPr>
+      </w:pPr>
+      <w:r>
         <w:t xml:space="preserve">The camera has surge protection but may be damaged by a significant surge or near lightning strike. </w:t>
       </w:r>
     </w:p>
     <w:p>
       <w:pPr>
         <w:ind w:left="720"/>
-        <w:rPr>
-          <w:lang w:val="en-US"/>
-        </w:rPr>
       </w:pPr>
     </w:p>
     <w:p>
@@ -5641,7 +4712,6 @@
           <w:color w:val="1F3763" w:themeColor="accent1" w:themeShade="7F"/>
           <w:sz w:val="36"/>
           <w:szCs w:val="36"/>
-          <w:lang w:val="en-US"/>
         </w:rPr>
       </w:pPr>
       <w:bookmarkStart w:id="1" w:name="_Ref43225353"/>
@@ -5651,7 +4721,6 @@
           <w:bCs/>
           <w:sz w:val="36"/>
           <w:szCs w:val="36"/>
-          <w:lang w:val="en-US"/>
         </w:rPr>
         <w:br w:type="page"/>
       </w:r>
@@ -5664,7 +4733,6 @@
           <w:bCs/>
           <w:sz w:val="36"/>
           <w:szCs w:val="36"/>
-          <w:lang w:val="en-US"/>
         </w:rPr>
       </w:pPr>
       <w:r>
@@ -5673,77 +4741,50 @@
           <w:bCs/>
           <w:sz w:val="36"/>
           <w:szCs w:val="36"/>
-          <w:lang w:val="en-US"/>
         </w:rPr>
+        <w:lastRenderedPageBreak/>
         <w:t>Appendix: Formatting an SDHC card with FAT32</w:t>
       </w:r>
       <w:bookmarkEnd w:id="1"/>
     </w:p>
-    <w:p>
-      <w:pPr>
-        <w:rPr>
-          <w:lang w:val="en-US"/>
-        </w:rPr>
-      </w:pPr>
-    </w:p>
+    <w:p/>
     <w:p>
       <w:pPr>
         <w:ind w:left="360"/>
-        <w:rPr>
-          <w:lang w:val="en-US"/>
-        </w:rPr>
-      </w:pPr>
-      <w:r>
-        <w:rPr>
-          <w:lang w:val="en-US"/>
-        </w:rPr>
+      </w:pPr>
+      <w:r>
         <w:t xml:space="preserve">The SDHC card must be formatted as FAT32. This is typically not a problem for cards of 32GB or smaller as they generally are pre-formatted as FAT32, however larger cards are usually formatted with </w:t>
       </w:r>
       <w:proofErr w:type="spellStart"/>
       <w:r>
-        <w:rPr>
-          <w:lang w:val="en-US"/>
-        </w:rPr>
         <w:t>exFat</w:t>
       </w:r>
       <w:proofErr w:type="spellEnd"/>
       <w:r>
-        <w:rPr>
-          <w:lang w:val="en-US"/>
-        </w:rPr>
-        <w:t xml:space="preserve"> which is not compatible with the XLink2-500. In addition, while it’s possible to format a disk larger than 32GB with FAT32 using a PC, it’s not easy to do without using 3</w:t>
+        <w:t xml:space="preserve"> which is not compatible with the </w:t>
+      </w:r>
+      <w:r>
+        <w:t>XLink 500</w:t>
+      </w:r>
+      <w:r>
+        <w:t>. In addition, while it’s possible to format a disk larger than 32GB with FAT32 using a PC, it’s not easy to do without using 3</w:t>
       </w:r>
       <w:r>
         <w:rPr>
           <w:vertAlign w:val="superscript"/>
-          <w:lang w:val="en-US"/>
         </w:rPr>
         <w:t>rd</w:t>
       </w:r>
       <w:r>
-        <w:rPr>
-          <w:lang w:val="en-US"/>
-        </w:rPr>
-        <w:t xml:space="preserve"> party programs.  Here’s how it can be done using </w:t>
-      </w:r>
-      <w:proofErr w:type="spellStart"/>
-      <w:r>
-        <w:rPr>
-          <w:lang w:val="en-US"/>
-        </w:rPr>
-        <w:t>LinkComm</w:t>
-      </w:r>
-      <w:proofErr w:type="spellEnd"/>
-      <w:r>
-        <w:rPr>
-          <w:lang w:val="en-US"/>
-        </w:rPr>
-        <w:t xml:space="preserve"> and the XLink2-500:</w:t>
-      </w:r>
-      <w:r>
-        <w:rPr>
-          <w:lang w:val="en-US"/>
-        </w:rPr>
+        <w:t xml:space="preserve"> party programs.  Here’s how it can be done using LinkComm and the </w:t>
+      </w:r>
+      <w:r>
+        <w:t>XLink 500</w:t>
+      </w:r>
+      <w:r>
+        <w:t>:</w:t>
+      </w:r>
+      <w:r>
         <w:br/>
       </w:r>
     </w:p>
@@ -5788,7 +4829,13 @@
         </w:numPr>
       </w:pPr>
       <w:r>
-        <w:t xml:space="preserve">If the response is “Drive is not mounted” then the XLink2-500 was not able to read the card and you will probably need to format the card before you’ll be able to use it. </w:t>
+        <w:t xml:space="preserve">If the response is “Drive is not mounted” then the </w:t>
+      </w:r>
+      <w:r>
+        <w:t>XLink 500</w:t>
+      </w:r>
+      <w:r>
+        <w:t xml:space="preserve"> was not able to read the card and you will probably need to format the card before you’ll be able to use it. </w:t>
       </w:r>
       <w:r>
         <w:rPr>
@@ -5798,15 +4845,7 @@
         <w:t>Warning</w:t>
       </w:r>
       <w:r>
-        <w:t xml:space="preserve">! formatting the card will delete </w:t>
-      </w:r>
-      <w:proofErr w:type="gramStart"/>
-      <w:r>
-        <w:t>any and all</w:t>
-      </w:r>
-      <w:proofErr w:type="gramEnd"/>
-      <w:r>
-        <w:t xml:space="preserve"> data that was previously on the card. </w:t>
+        <w:t xml:space="preserve">! formatting the card will delete any and all data that was previously on the card. </w:t>
       </w:r>
     </w:p>
     <w:p>
@@ -5870,7 +4909,13 @@
         </w:numPr>
       </w:pPr>
       <w:r>
-        <w:t>Issue the command “file test” if you wish to verify that the XLink2-500 can read and write the card.</w:t>
+        <w:t xml:space="preserve">Issue the command “file test” if you wish to verify that the </w:t>
+      </w:r>
+      <w:r>
+        <w:t>XLink 500</w:t>
+      </w:r>
+      <w:r>
+        <w:t xml:space="preserve"> can read and write the card.</w:t>
       </w:r>
     </w:p>
     <w:p>
@@ -5880,13 +4925,11 @@
         <w:rPr>
           <w:sz w:val="18"/>
           <w:szCs w:val="18"/>
-          <w:lang w:val="en-US"/>
         </w:rPr>
       </w:pPr>
     </w:p>
     <w:sectPr>
       <w:headerReference w:type="default" r:id="rId16"/>
-      <w:footerReference w:type="default" r:id="rId17"/>
       <w:pgSz w:w="12240" w:h="15840"/>
       <w:pgMar w:top="2552" w:right="1418" w:bottom="1418" w:left="1418" w:header="709" w:footer="709" w:gutter="0"/>
       <w:cols w:space="708"/>
@@ -5897,7 +4940,7 @@
 </file>
 
 <file path=word/endnotes.xml><?xml version="1.0" encoding="utf-8"?>
-<w:endnotes xmlns:wpc="http://schemas.microsoft.com/office/word/2010/wordprocessingCanvas" xmlns:cx="http://schemas.microsoft.com/office/drawing/2014/chartex" xmlns:cx1="http://schemas.microsoft.com/office/drawing/2015/9/8/chartex" xmlns:cx2="http://schemas.microsoft.com/office/drawing/2015/10/21/chartex" xmlns:cx3="http://schemas.microsoft.com/office/drawing/2016/5/9/chartex" xmlns:cx4="http://schemas.microsoft.com/office/drawing/2016/5/10/chartex" xmlns:cx5="http://schemas.microsoft.com/office/drawing/2016/5/11/chartex" xmlns:cx6="http://schemas.microsoft.com/office/drawing/2016/5/12/chartex" xmlns:cx7="http://schemas.microsoft.com/office/drawing/2016/5/13/chartex" xmlns:cx8="http://schemas.microsoft.com/office/drawing/2016/5/14/chartex" xmlns:mc="http://schemas.openxmlformats.org/markup-compatibility/2006" xmlns:aink="http://schemas.microsoft.com/office/drawing/2016/ink" xmlns:am3d="http://schemas.microsoft.com/office/drawing/2017/model3d" xmlns:o="urn:schemas-microsoft-com:office:office" xmlns:r="http://schemas.openxmlformats.org/officeDocument/2006/relationships" xmlns:m="http://schemas.openxmlformats.org/officeDocument/2006/math" xmlns:v="urn:schemas-microsoft-com:vml" xmlns:wp14="http://schemas.microsoft.com/office/word/2010/wordprocessingDrawing" xmlns:wp="http://schemas.openxmlformats.org/drawingml/2006/wordprocessingDrawing" xmlns:w10="urn:schemas-microsoft-com:office:word" xmlns:w="http://schemas.openxmlformats.org/wordprocessingml/2006/main" xmlns:w14="http://schemas.microsoft.com/office/word/2010/wordml" xmlns:w15="http://schemas.microsoft.com/office/word/2012/wordml" xmlns:w16cex="http://schemas.microsoft.com/office/word/2018/wordml/cex" xmlns:w16cid="http://schemas.microsoft.com/office/word/2016/wordml/cid" xmlns:w16="http://schemas.microsoft.com/office/word/2018/wordml" xmlns:w16se="http://schemas.microsoft.com/office/word/2015/wordml/symex" xmlns:wpg="http://schemas.microsoft.com/office/word/2010/wordprocessingGroup" xmlns:wpi="http://schemas.microsoft.com/office/word/2010/wordprocessingInk" xmlns:wne="http://schemas.microsoft.com/office/word/2006/wordml" xmlns:wps="http://schemas.microsoft.com/office/word/2010/wordprocessingShape" mc:Ignorable="w14 w15 w16se w16cid w16 w16cex wp14">
+<w:endnotes xmlns:wpc="http://schemas.microsoft.com/office/word/2010/wordprocessingCanvas" xmlns:cx="http://schemas.microsoft.com/office/drawing/2014/chartex" xmlns:cx1="http://schemas.microsoft.com/office/drawing/2015/9/8/chartex" xmlns:cx2="http://schemas.microsoft.com/office/drawing/2015/10/21/chartex" xmlns:cx3="http://schemas.microsoft.com/office/drawing/2016/5/9/chartex" xmlns:cx4="http://schemas.microsoft.com/office/drawing/2016/5/10/chartex" xmlns:cx5="http://schemas.microsoft.com/office/drawing/2016/5/11/chartex" xmlns:cx6="http://schemas.microsoft.com/office/drawing/2016/5/12/chartex" xmlns:cx7="http://schemas.microsoft.com/office/drawing/2016/5/13/chartex" xmlns:cx8="http://schemas.microsoft.com/office/drawing/2016/5/14/chartex" xmlns:mc="http://schemas.openxmlformats.org/markup-compatibility/2006" xmlns:aink="http://schemas.microsoft.com/office/drawing/2016/ink" xmlns:am3d="http://schemas.microsoft.com/office/drawing/2017/model3d" xmlns:o="urn:schemas-microsoft-com:office:office" xmlns:oel="http://schemas.microsoft.com/office/2019/extlst" xmlns:r="http://schemas.openxmlformats.org/officeDocument/2006/relationships" xmlns:m="http://schemas.openxmlformats.org/officeDocument/2006/math" xmlns:v="urn:schemas-microsoft-com:vml" xmlns:wp14="http://schemas.microsoft.com/office/word/2010/wordprocessingDrawing" xmlns:wp="http://schemas.openxmlformats.org/drawingml/2006/wordprocessingDrawing" xmlns:w10="urn:schemas-microsoft-com:office:word" xmlns:w="http://schemas.openxmlformats.org/wordprocessingml/2006/main" xmlns:w14="http://schemas.microsoft.com/office/word/2010/wordml" xmlns:w15="http://schemas.microsoft.com/office/word/2012/wordml" xmlns:w16cex="http://schemas.microsoft.com/office/word/2018/wordml/cex" xmlns:w16cid="http://schemas.microsoft.com/office/word/2016/wordml/cid" xmlns:w16="http://schemas.microsoft.com/office/word/2018/wordml" xmlns:w16du="http://schemas.microsoft.com/office/word/2023/wordml/word16du" xmlns:w16sdtdh="http://schemas.microsoft.com/office/word/2020/wordml/sdtdatahash" xmlns:w16sdtfl="http://schemas.microsoft.com/office/word/2024/wordml/sdtformatlock" xmlns:w16se="http://schemas.microsoft.com/office/word/2015/wordml/symex" xmlns:wpg="http://schemas.microsoft.com/office/word/2010/wordprocessingGroup" xmlns:wpi="http://schemas.microsoft.com/office/word/2010/wordprocessingInk" xmlns:wne="http://schemas.microsoft.com/office/word/2006/wordml" xmlns:wps="http://schemas.microsoft.com/office/word/2010/wordprocessingShape" mc:Ignorable="w14 w15 w16se w16cid w16 w16cex w16sdtdh w16sdtfl w16du wp14">
   <w:endnote w:type="separator" w:id="-1">
     <w:p>
       <w:r>
@@ -5915,18 +4958,8 @@
 </w:endnotes>
 </file>
 
-<file path=word/footer1.xml><?xml version="1.0" encoding="utf-8"?>
-<w:ftr xmlns:wpc="http://schemas.microsoft.com/office/word/2010/wordprocessingCanvas" xmlns:cx="http://schemas.microsoft.com/office/drawing/2014/chartex" xmlns:cx1="http://schemas.microsoft.com/office/drawing/2015/9/8/chartex" xmlns:cx2="http://schemas.microsoft.com/office/drawing/2015/10/21/chartex" xmlns:cx3="http://schemas.microsoft.com/office/drawing/2016/5/9/chartex" xmlns:cx4="http://schemas.microsoft.com/office/drawing/2016/5/10/chartex" xmlns:cx5="http://schemas.microsoft.com/office/drawing/2016/5/11/chartex" xmlns:cx6="http://schemas.microsoft.com/office/drawing/2016/5/12/chartex" xmlns:cx7="http://schemas.microsoft.com/office/drawing/2016/5/13/chartex" xmlns:cx8="http://schemas.microsoft.com/office/drawing/2016/5/14/chartex" xmlns:mc="http://schemas.openxmlformats.org/markup-compatibility/2006" xmlns:aink="http://schemas.microsoft.com/office/drawing/2016/ink" xmlns:am3d="http://schemas.microsoft.com/office/drawing/2017/model3d" xmlns:o="urn:schemas-microsoft-com:office:office" xmlns:r="http://schemas.openxmlformats.org/officeDocument/2006/relationships" xmlns:m="http://schemas.openxmlformats.org/officeDocument/2006/math" xmlns:v="urn:schemas-microsoft-com:vml" xmlns:wp14="http://schemas.microsoft.com/office/word/2010/wordprocessingDrawing" xmlns:wp="http://schemas.openxmlformats.org/drawingml/2006/wordprocessingDrawing" xmlns:w10="urn:schemas-microsoft-com:office:word" xmlns:w="http://schemas.openxmlformats.org/wordprocessingml/2006/main" xmlns:w14="http://schemas.microsoft.com/office/word/2010/wordml" xmlns:w15="http://schemas.microsoft.com/office/word/2012/wordml" xmlns:w16cex="http://schemas.microsoft.com/office/word/2018/wordml/cex" xmlns:w16cid="http://schemas.microsoft.com/office/word/2016/wordml/cid" xmlns:w16="http://schemas.microsoft.com/office/word/2018/wordml" xmlns:w16se="http://schemas.microsoft.com/office/word/2015/wordml/symex" xmlns:wpg="http://schemas.microsoft.com/office/word/2010/wordprocessingGroup" xmlns:wpi="http://schemas.microsoft.com/office/word/2010/wordprocessingInk" xmlns:wne="http://schemas.microsoft.com/office/word/2006/wordml" xmlns:wps="http://schemas.microsoft.com/office/word/2010/wordprocessingShape" mc:Ignorable="w14 w15 w16se w16cid w16 w16cex wp14">
-  <w:p>
-    <w:pPr>
-      <w:pStyle w:val="Footer"/>
-    </w:pPr>
-  </w:p>
-</w:ftr>
-</file>
-
 <file path=word/footnotes.xml><?xml version="1.0" encoding="utf-8"?>
-<w:footnotes xmlns:wpc="http://schemas.microsoft.com/office/word/2010/wordprocessingCanvas" xmlns:cx="http://schemas.microsoft.com/office/drawing/2014/chartex" xmlns:cx1="http://schemas.microsoft.com/office/drawing/2015/9/8/chartex" xmlns:cx2="http://schemas.microsoft.com/office/drawing/2015/10/21/chartex" xmlns:cx3="http://schemas.microsoft.com/office/drawing/2016/5/9/chartex" xmlns:cx4="http://schemas.microsoft.com/office/drawing/2016/5/10/chartex" xmlns:cx5="http://schemas.microsoft.com/office/drawing/2016/5/11/chartex" xmlns:cx6="http://schemas.microsoft.com/office/drawing/2016/5/12/chartex" xmlns:cx7="http://schemas.microsoft.com/office/drawing/2016/5/13/chartex" xmlns:cx8="http://schemas.microsoft.com/office/drawing/2016/5/14/chartex" xmlns:mc="http://schemas.openxmlformats.org/markup-compatibility/2006" xmlns:aink="http://schemas.microsoft.com/office/drawing/2016/ink" xmlns:am3d="http://schemas.microsoft.com/office/drawing/2017/model3d" xmlns:o="urn:schemas-microsoft-com:office:office" xmlns:r="http://schemas.openxmlformats.org/officeDocument/2006/relationships" xmlns:m="http://schemas.openxmlformats.org/officeDocument/2006/math" xmlns:v="urn:schemas-microsoft-com:vml" xmlns:wp14="http://schemas.microsoft.com/office/word/2010/wordprocessingDrawing" xmlns:wp="http://schemas.openxmlformats.org/drawingml/2006/wordprocessingDrawing" xmlns:w10="urn:schemas-microsoft-com:office:word" xmlns:w="http://schemas.openxmlformats.org/wordprocessingml/2006/main" xmlns:w14="http://schemas.microsoft.com/office/word/2010/wordml" xmlns:w15="http://schemas.microsoft.com/office/word/2012/wordml" xmlns:w16cex="http://schemas.microsoft.com/office/word/2018/wordml/cex" xmlns:w16cid="http://schemas.microsoft.com/office/word/2016/wordml/cid" xmlns:w16="http://schemas.microsoft.com/office/word/2018/wordml" xmlns:w16se="http://schemas.microsoft.com/office/word/2015/wordml/symex" xmlns:wpg="http://schemas.microsoft.com/office/word/2010/wordprocessingGroup" xmlns:wpi="http://schemas.microsoft.com/office/word/2010/wordprocessingInk" xmlns:wne="http://schemas.microsoft.com/office/word/2006/wordml" xmlns:wps="http://schemas.microsoft.com/office/word/2010/wordprocessingShape" mc:Ignorable="w14 w15 w16se w16cid w16 w16cex wp14">
+<w:footnotes xmlns:wpc="http://schemas.microsoft.com/office/word/2010/wordprocessingCanvas" xmlns:cx="http://schemas.microsoft.com/office/drawing/2014/chartex" xmlns:cx1="http://schemas.microsoft.com/office/drawing/2015/9/8/chartex" xmlns:cx2="http://schemas.microsoft.com/office/drawing/2015/10/21/chartex" xmlns:cx3="http://schemas.microsoft.com/office/drawing/2016/5/9/chartex" xmlns:cx4="http://schemas.microsoft.com/office/drawing/2016/5/10/chartex" xmlns:cx5="http://schemas.microsoft.com/office/drawing/2016/5/11/chartex" xmlns:cx6="http://schemas.microsoft.com/office/drawing/2016/5/12/chartex" xmlns:cx7="http://schemas.microsoft.com/office/drawing/2016/5/13/chartex" xmlns:cx8="http://schemas.microsoft.com/office/drawing/2016/5/14/chartex" xmlns:mc="http://schemas.openxmlformats.org/markup-compatibility/2006" xmlns:aink="http://schemas.microsoft.com/office/drawing/2016/ink" xmlns:am3d="http://schemas.microsoft.com/office/drawing/2017/model3d" xmlns:o="urn:schemas-microsoft-com:office:office" xmlns:oel="http://schemas.microsoft.com/office/2019/extlst" xmlns:r="http://schemas.openxmlformats.org/officeDocument/2006/relationships" xmlns:m="http://schemas.openxmlformats.org/officeDocument/2006/math" xmlns:v="urn:schemas-microsoft-com:vml" xmlns:wp14="http://schemas.microsoft.com/office/word/2010/wordprocessingDrawing" xmlns:wp="http://schemas.openxmlformats.org/drawingml/2006/wordprocessingDrawing" xmlns:w10="urn:schemas-microsoft-com:office:word" xmlns:w="http://schemas.openxmlformats.org/wordprocessingml/2006/main" xmlns:w14="http://schemas.microsoft.com/office/word/2010/wordml" xmlns:w15="http://schemas.microsoft.com/office/word/2012/wordml" xmlns:w16cex="http://schemas.microsoft.com/office/word/2018/wordml/cex" xmlns:w16cid="http://schemas.microsoft.com/office/word/2016/wordml/cid" xmlns:w16="http://schemas.microsoft.com/office/word/2018/wordml" xmlns:w16du="http://schemas.microsoft.com/office/word/2023/wordml/word16du" xmlns:w16sdtdh="http://schemas.microsoft.com/office/word/2020/wordml/sdtdatahash" xmlns:w16sdtfl="http://schemas.microsoft.com/office/word/2024/wordml/sdtformatlock" xmlns:w16se="http://schemas.microsoft.com/office/word/2015/wordml/symex" xmlns:wpg="http://schemas.microsoft.com/office/word/2010/wordprocessingGroup" xmlns:wpi="http://schemas.microsoft.com/office/word/2010/wordprocessingInk" xmlns:wne="http://schemas.microsoft.com/office/word/2006/wordml" xmlns:wps="http://schemas.microsoft.com/office/word/2010/wordprocessingShape" mc:Ignorable="w14 w15 w16se w16cid w16 w16cex w16sdtdh w16sdtfl w16du wp14">
   <w:footnote w:type="separator" w:id="-1">
     <w:p>
       <w:r>
@@ -5945,7 +4978,7 @@
 </file>
 
 <file path=word/header1.xml><?xml version="1.0" encoding="utf-8"?>
-<w:hdr xmlns:wpc="http://schemas.microsoft.com/office/word/2010/wordprocessingCanvas" xmlns:cx="http://schemas.microsoft.com/office/drawing/2014/chartex" xmlns:cx1="http://schemas.microsoft.com/office/drawing/2015/9/8/chartex" xmlns:cx2="http://schemas.microsoft.com/office/drawing/2015/10/21/chartex" xmlns:cx3="http://schemas.microsoft.com/office/drawing/2016/5/9/chartex" xmlns:cx4="http://schemas.microsoft.com/office/drawing/2016/5/10/chartex" xmlns:cx5="http://schemas.microsoft.com/office/drawing/2016/5/11/chartex" xmlns:cx6="http://schemas.microsoft.com/office/drawing/2016/5/12/chartex" xmlns:cx7="http://schemas.microsoft.com/office/drawing/2016/5/13/chartex" xmlns:cx8="http://schemas.microsoft.com/office/drawing/2016/5/14/chartex" xmlns:mc="http://schemas.openxmlformats.org/markup-compatibility/2006" xmlns:aink="http://schemas.microsoft.com/office/drawing/2016/ink" xmlns:am3d="http://schemas.microsoft.com/office/drawing/2017/model3d" xmlns:o="urn:schemas-microsoft-com:office:office" xmlns:r="http://schemas.openxmlformats.org/officeDocument/2006/relationships" xmlns:m="http://schemas.openxmlformats.org/officeDocument/2006/math" xmlns:v="urn:schemas-microsoft-com:vml" xmlns:wp14="http://schemas.microsoft.com/office/word/2010/wordprocessingDrawing" xmlns:wp="http://schemas.openxmlformats.org/drawingml/2006/wordprocessingDrawing" xmlns:w10="urn:schemas-microsoft-com:office:word" xmlns:w="http://schemas.openxmlformats.org/wordprocessingml/2006/main" xmlns:w14="http://schemas.microsoft.com/office/word/2010/wordml" xmlns:w15="http://schemas.microsoft.com/office/word/2012/wordml" xmlns:w16cex="http://schemas.microsoft.com/office/word/2018/wordml/cex" xmlns:w16cid="http://schemas.microsoft.com/office/word/2016/wordml/cid" xmlns:w16="http://schemas.microsoft.com/office/word/2018/wordml" xmlns:w16se="http://schemas.microsoft.com/office/word/2015/wordml/symex" xmlns:wpg="http://schemas.microsoft.com/office/word/2010/wordprocessingGroup" xmlns:wpi="http://schemas.microsoft.com/office/word/2010/wordprocessingInk" xmlns:wne="http://schemas.microsoft.com/office/word/2006/wordml" xmlns:wps="http://schemas.microsoft.com/office/word/2010/wordprocessingShape" mc:Ignorable="w14 w15 w16se w16cid w16 w16cex wp14">
+<w:hdr xmlns:wpc="http://schemas.microsoft.com/office/word/2010/wordprocessingCanvas" xmlns:cx="http://schemas.microsoft.com/office/drawing/2014/chartex" xmlns:cx1="http://schemas.microsoft.com/office/drawing/2015/9/8/chartex" xmlns:cx2="http://schemas.microsoft.com/office/drawing/2015/10/21/chartex" xmlns:cx3="http://schemas.microsoft.com/office/drawing/2016/5/9/chartex" xmlns:cx4="http://schemas.microsoft.com/office/drawing/2016/5/10/chartex" xmlns:cx5="http://schemas.microsoft.com/office/drawing/2016/5/11/chartex" xmlns:cx6="http://schemas.microsoft.com/office/drawing/2016/5/12/chartex" xmlns:cx7="http://schemas.microsoft.com/office/drawing/2016/5/13/chartex" xmlns:cx8="http://schemas.microsoft.com/office/drawing/2016/5/14/chartex" xmlns:mc="http://schemas.openxmlformats.org/markup-compatibility/2006" xmlns:aink="http://schemas.microsoft.com/office/drawing/2016/ink" xmlns:am3d="http://schemas.microsoft.com/office/drawing/2017/model3d" xmlns:o="urn:schemas-microsoft-com:office:office" xmlns:oel="http://schemas.microsoft.com/office/2019/extlst" xmlns:r="http://schemas.openxmlformats.org/officeDocument/2006/relationships" xmlns:m="http://schemas.openxmlformats.org/officeDocument/2006/math" xmlns:v="urn:schemas-microsoft-com:vml" xmlns:wp14="http://schemas.microsoft.com/office/word/2010/wordprocessingDrawing" xmlns:wp="http://schemas.openxmlformats.org/drawingml/2006/wordprocessingDrawing" xmlns:w10="urn:schemas-microsoft-com:office:word" xmlns:w="http://schemas.openxmlformats.org/wordprocessingml/2006/main" xmlns:w14="http://schemas.microsoft.com/office/word/2010/wordml" xmlns:w15="http://schemas.microsoft.com/office/word/2012/wordml" xmlns:w16cex="http://schemas.microsoft.com/office/word/2018/wordml/cex" xmlns:w16cid="http://schemas.microsoft.com/office/word/2016/wordml/cid" xmlns:w16="http://schemas.microsoft.com/office/word/2018/wordml" xmlns:w16du="http://schemas.microsoft.com/office/word/2023/wordml/word16du" xmlns:w16sdtdh="http://schemas.microsoft.com/office/word/2020/wordml/sdtdatahash" xmlns:w16sdtfl="http://schemas.microsoft.com/office/word/2024/wordml/sdtformatlock" xmlns:w16se="http://schemas.microsoft.com/office/word/2015/wordml/symex" xmlns:wpg="http://schemas.microsoft.com/office/word/2010/wordprocessingGroup" xmlns:wpi="http://schemas.microsoft.com/office/word/2010/wordprocessingInk" xmlns:wne="http://schemas.microsoft.com/office/word/2006/wordml" xmlns:wps="http://schemas.microsoft.com/office/word/2010/wordprocessingShape" mc:Ignorable="w14 w15 w16se w16cid w16 w16cex w16sdtdh w16sdtfl w16du wp14">
   <w:p>
     <w:pPr>
       <w:pStyle w:val="Header"/>
@@ -5955,14 +4988,8 @@
         <w:tab w:val="left" w:pos="4080"/>
       </w:tabs>
       <w:jc w:val="center"/>
-      <w:rPr>
-        <w:lang w:val="en-US"/>
-      </w:rPr>
     </w:pPr>
     <w:r>
-      <w:rPr>
-        <w:noProof/>
-      </w:rPr>
       <w:drawing>
         <wp:anchor distT="0" distB="0" distL="114300" distR="114300" simplePos="0" relativeHeight="251658240" behindDoc="1" locked="0" layoutInCell="1" allowOverlap="1" wp14:anchorId="504DCA6D" wp14:editId="73A299AF">
           <wp:simplePos x="0" y="0"/>
@@ -6020,15 +5047,18 @@
       </w:drawing>
     </w:r>
     <w:r>
-      <w:rPr>
-        <w:lang w:val="en-US"/>
-      </w:rPr>
-      <w:t>Using Camera485 with the XLink-</w:t>
+      <w:t xml:space="preserve">Using Camera485 with </w:t>
     </w:r>
     <w:r>
-      <w:rPr>
-        <w:lang w:val="en-US"/>
-      </w:rPr>
+      <w:t xml:space="preserve">Sutron </w:t>
+    </w:r>
+    <w:r>
+      <w:t>XLink</w:t>
+    </w:r>
+    <w:r>
+      <w:t xml:space="preserve"> </w:t>
+    </w:r>
+    <w:r>
       <w:t>500</w:t>
     </w:r>
   </w:p>
@@ -6036,7 +5066,7 @@
 </file>
 
 <file path=word/numbering.xml><?xml version="1.0" encoding="utf-8"?>
-<w:numbering xmlns:wpc="http://schemas.microsoft.com/office/word/2010/wordprocessingCanvas" xmlns:cx="http://schemas.microsoft.com/office/drawing/2014/chartex" xmlns:cx1="http://schemas.microsoft.com/office/drawing/2015/9/8/chartex" xmlns:cx2="http://schemas.microsoft.com/office/drawing/2015/10/21/chartex" xmlns:cx3="http://schemas.microsoft.com/office/drawing/2016/5/9/chartex" xmlns:cx4="http://schemas.microsoft.com/office/drawing/2016/5/10/chartex" xmlns:cx5="http://schemas.microsoft.com/office/drawing/2016/5/11/chartex" xmlns:cx6="http://schemas.microsoft.com/office/drawing/2016/5/12/chartex" xmlns:cx7="http://schemas.microsoft.com/office/drawing/2016/5/13/chartex" xmlns:cx8="http://schemas.microsoft.com/office/drawing/2016/5/14/chartex" xmlns:mc="http://schemas.openxmlformats.org/markup-compatibility/2006" xmlns:aink="http://schemas.microsoft.com/office/drawing/2016/ink" xmlns:am3d="http://schemas.microsoft.com/office/drawing/2017/model3d" xmlns:o="urn:schemas-microsoft-com:office:office" xmlns:r="http://schemas.openxmlformats.org/officeDocument/2006/relationships" xmlns:m="http://schemas.openxmlformats.org/officeDocument/2006/math" xmlns:v="urn:schemas-microsoft-com:vml" xmlns:wp14="http://schemas.microsoft.com/office/word/2010/wordprocessingDrawing" xmlns:wp="http://schemas.openxmlformats.org/drawingml/2006/wordprocessingDrawing" xmlns:w10="urn:schemas-microsoft-com:office:word" xmlns:w="http://schemas.openxmlformats.org/wordprocessingml/2006/main" xmlns:w14="http://schemas.microsoft.com/office/word/2010/wordml" xmlns:w15="http://schemas.microsoft.com/office/word/2012/wordml" xmlns:w16cex="http://schemas.microsoft.com/office/word/2018/wordml/cex" xmlns:w16cid="http://schemas.microsoft.com/office/word/2016/wordml/cid" xmlns:w16="http://schemas.microsoft.com/office/word/2018/wordml" xmlns:w16se="http://schemas.microsoft.com/office/word/2015/wordml/symex" xmlns:wpg="http://schemas.microsoft.com/office/word/2010/wordprocessingGroup" xmlns:wpi="http://schemas.microsoft.com/office/word/2010/wordprocessingInk" xmlns:wne="http://schemas.microsoft.com/office/word/2006/wordml" xmlns:wps="http://schemas.microsoft.com/office/word/2010/wordprocessingShape" mc:Ignorable="w14 w15 w16se w16cid w16 w16cex wp14">
+<w:numbering xmlns:wpc="http://schemas.microsoft.com/office/word/2010/wordprocessingCanvas" xmlns:cx="http://schemas.microsoft.com/office/drawing/2014/chartex" xmlns:cx1="http://schemas.microsoft.com/office/drawing/2015/9/8/chartex" xmlns:cx2="http://schemas.microsoft.com/office/drawing/2015/10/21/chartex" xmlns:cx3="http://schemas.microsoft.com/office/drawing/2016/5/9/chartex" xmlns:cx4="http://schemas.microsoft.com/office/drawing/2016/5/10/chartex" xmlns:cx5="http://schemas.microsoft.com/office/drawing/2016/5/11/chartex" xmlns:cx6="http://schemas.microsoft.com/office/drawing/2016/5/12/chartex" xmlns:cx7="http://schemas.microsoft.com/office/drawing/2016/5/13/chartex" xmlns:cx8="http://schemas.microsoft.com/office/drawing/2016/5/14/chartex" xmlns:mc="http://schemas.openxmlformats.org/markup-compatibility/2006" xmlns:aink="http://schemas.microsoft.com/office/drawing/2016/ink" xmlns:am3d="http://schemas.microsoft.com/office/drawing/2017/model3d" xmlns:o="urn:schemas-microsoft-com:office:office" xmlns:oel="http://schemas.microsoft.com/office/2019/extlst" xmlns:r="http://schemas.openxmlformats.org/officeDocument/2006/relationships" xmlns:m="http://schemas.openxmlformats.org/officeDocument/2006/math" xmlns:v="urn:schemas-microsoft-com:vml" xmlns:wp14="http://schemas.microsoft.com/office/word/2010/wordprocessingDrawing" xmlns:wp="http://schemas.openxmlformats.org/drawingml/2006/wordprocessingDrawing" xmlns:w10="urn:schemas-microsoft-com:office:word" xmlns:w="http://schemas.openxmlformats.org/wordprocessingml/2006/main" xmlns:w14="http://schemas.microsoft.com/office/word/2010/wordml" xmlns:w15="http://schemas.microsoft.com/office/word/2012/wordml" xmlns:w16cex="http://schemas.microsoft.com/office/word/2018/wordml/cex" xmlns:w16cid="http://schemas.microsoft.com/office/word/2016/wordml/cid" xmlns:w16="http://schemas.microsoft.com/office/word/2018/wordml" xmlns:w16du="http://schemas.microsoft.com/office/word/2023/wordml/word16du" xmlns:w16sdtdh="http://schemas.microsoft.com/office/word/2020/wordml/sdtdatahash" xmlns:w16sdtfl="http://schemas.microsoft.com/office/word/2024/wordml/sdtformatlock" xmlns:w16se="http://schemas.microsoft.com/office/word/2015/wordml/symex" xmlns:wpg="http://schemas.microsoft.com/office/word/2010/wordprocessingGroup" xmlns:wpi="http://schemas.microsoft.com/office/word/2010/wordprocessingInk" xmlns:wne="http://schemas.microsoft.com/office/word/2006/wordml" xmlns:wps="http://schemas.microsoft.com/office/word/2010/wordprocessingShape" mc:Ignorable="w14 w15 w16se w16cid w16 w16cex w16sdtdh w16sdtfl w16du wp14">
   <w:abstractNum w:abstractNumId="0" w15:restartNumberingAfterBreak="0">
     <w:nsid w:val="0E5463A5"/>
     <w:multiLevelType w:val="hybridMultilevel"/>
@@ -6687,29 +5717,29 @@
       </w:rPr>
     </w:lvl>
   </w:abstractNum>
-  <w:num w:numId="1">
+  <w:num w:numId="1" w16cid:durableId="1921908957">
     <w:abstractNumId w:val="2"/>
   </w:num>
-  <w:num w:numId="2">
+  <w:num w:numId="2" w16cid:durableId="1377468233">
     <w:abstractNumId w:val="1"/>
   </w:num>
-  <w:num w:numId="3">
+  <w:num w:numId="3" w16cid:durableId="517550870">
     <w:abstractNumId w:val="4"/>
   </w:num>
-  <w:num w:numId="4">
+  <w:num w:numId="4" w16cid:durableId="564268572">
     <w:abstractNumId w:val="0"/>
   </w:num>
-  <w:num w:numId="5">
+  <w:num w:numId="5" w16cid:durableId="32391342">
     <w:abstractNumId w:val="3"/>
   </w:num>
-  <w:num w:numId="6">
+  <w:num w:numId="6" w16cid:durableId="576137012">
     <w:abstractNumId w:val="5"/>
   </w:num>
 </w:numbering>
 </file>
 
 <file path=word/styles.xml><?xml version="1.0" encoding="utf-8"?>
-<w:styles xmlns:mc="http://schemas.openxmlformats.org/markup-compatibility/2006" xmlns:r="http://schemas.openxmlformats.org/officeDocument/2006/relationships" xmlns:w="http://schemas.openxmlformats.org/wordprocessingml/2006/main" xmlns:w14="http://schemas.microsoft.com/office/word/2010/wordml" xmlns:w15="http://schemas.microsoft.com/office/word/2012/wordml" xmlns:w16cex="http://schemas.microsoft.com/office/word/2018/wordml/cex" xmlns:w16cid="http://schemas.microsoft.com/office/word/2016/wordml/cid" xmlns:w16="http://schemas.microsoft.com/office/word/2018/wordml" xmlns:w16se="http://schemas.microsoft.com/office/word/2015/wordml/symex" mc:Ignorable="w14 w15 w16se w16cid w16 w16cex">
+<w:styles xmlns:mc="http://schemas.openxmlformats.org/markup-compatibility/2006" xmlns:r="http://schemas.openxmlformats.org/officeDocument/2006/relationships" xmlns:w="http://schemas.openxmlformats.org/wordprocessingml/2006/main" xmlns:w14="http://schemas.microsoft.com/office/word/2010/wordml" xmlns:w15="http://schemas.microsoft.com/office/word/2012/wordml" xmlns:w16cex="http://schemas.microsoft.com/office/word/2018/wordml/cex" xmlns:w16cid="http://schemas.microsoft.com/office/word/2016/wordml/cid" xmlns:w16="http://schemas.microsoft.com/office/word/2018/wordml" xmlns:w16du="http://schemas.microsoft.com/office/word/2023/wordml/word16du" xmlns:w16sdtdh="http://schemas.microsoft.com/office/word/2020/wordml/sdtdatahash" xmlns:w16sdtfl="http://schemas.microsoft.com/office/word/2024/wordml/sdtformatlock" xmlns:w16se="http://schemas.microsoft.com/office/word/2015/wordml/symex" mc:Ignorable="w14 w15 w16se w16cid w16 w16cex w16sdtdh w16sdtfl w16du">
   <w:docDefaults>
     <w:rPrDefault>
       <w:rPr>
@@ -7104,6 +6134,7 @@
     <w:qFormat/>
     <w:rPr>
       <w:rFonts w:eastAsiaTheme="minorEastAsia"/>
+      <w:lang w:val="en-US"/>
     </w:rPr>
   </w:style>
   <w:style w:type="paragraph" w:styleId="Heading3">
@@ -7146,7 +6177,6 @@
       <w:color w:val="0070C0"/>
       <w:sz w:val="56"/>
       <w:szCs w:val="20"/>
-      <w:lang w:val="en-US"/>
     </w:rPr>
   </w:style>
   <w:style w:type="character" w:default="1" w:styleId="DefaultParagraphFont">
@@ -7265,7 +6295,6 @@
       <w:rFonts w:eastAsia="Times New Roman" w:cs="Times New Roman"/>
       <w:sz w:val="22"/>
       <w:szCs w:val="20"/>
-      <w:lang w:val="en-US"/>
     </w:rPr>
   </w:style>
   <w:style w:type="table" w:styleId="PlainTable5">
@@ -7510,7 +6539,6 @@
       <w:rFonts w:ascii="Courier New" w:eastAsia="Times New Roman" w:hAnsi="Courier New" w:cs="Courier New"/>
       <w:sz w:val="20"/>
       <w:szCs w:val="20"/>
-      <w:lang w:val="en-US"/>
     </w:rPr>
   </w:style>
   <w:style w:type="character" w:customStyle="1" w:styleId="HTMLPreformattedChar">
@@ -7591,6 +6619,39 @@
         <w:insideV w:val="single" w:sz="4" w:space="0" w:color="auto"/>
       </w:tblBorders>
     </w:tblPr>
+  </w:style>
+  <w:style w:type="paragraph" w:styleId="Title">
+    <w:name w:val="Title"/>
+    <w:basedOn w:val="Normal"/>
+    <w:next w:val="Normal"/>
+    <w:link w:val="TitleChar"/>
+    <w:uiPriority w:val="10"/>
+    <w:qFormat/>
+    <w:rsid w:val="005E6246"/>
+    <w:pPr>
+      <w:contextualSpacing/>
+    </w:pPr>
+    <w:rPr>
+      <w:rFonts w:asciiTheme="majorHAnsi" w:eastAsiaTheme="majorEastAsia" w:hAnsiTheme="majorHAnsi" w:cstheme="majorBidi"/>
+      <w:spacing w:val="-10"/>
+      <w:kern w:val="28"/>
+      <w:sz w:val="56"/>
+      <w:szCs w:val="56"/>
+    </w:rPr>
+  </w:style>
+  <w:style w:type="character" w:customStyle="1" w:styleId="TitleChar">
+    <w:name w:val="Title Char"/>
+    <w:basedOn w:val="DefaultParagraphFont"/>
+    <w:link w:val="Title"/>
+    <w:uiPriority w:val="10"/>
+    <w:rsid w:val="005E6246"/>
+    <w:rPr>
+      <w:rFonts w:asciiTheme="majorHAnsi" w:eastAsiaTheme="majorEastAsia" w:hAnsiTheme="majorHAnsi" w:cstheme="majorBidi"/>
+      <w:spacing w:val="-10"/>
+      <w:kern w:val="28"/>
+      <w:sz w:val="56"/>
+      <w:szCs w:val="56"/>
+    </w:rPr>
   </w:style>
 </w:styles>
 </file>
@@ -12051,4 +11112,10 @@
     <ds:schemaRef ds:uri="http://schemas.openxmlformats.org/officeDocument/2006/bibliography"/>
   </ds:schemaRefs>
 </ds:datastoreItem>
+</file>
+
+<file path=docMetadata/LabelInfo.xml><?xml version="1.0" encoding="utf-8"?>
+<clbl:labelList xmlns:clbl="http://schemas.microsoft.com/office/2020/mipLabelMetadata">
+  <clbl:label id="{75c9361e-11db-4cdb-bb28-a56c50666d3c}" enabled="1" method="Privileged" siteId="{2c518df7-6644-41f8-8350-3f75e61362ac}" contentBits="0" removed="0"/>
+</clbl:labelList>
 </file>
</xml_diff>

<commit_message>
minor correction to remove implication that FTP must be used
</commit_message>
<xml_diff>
--- a/projects/Camera485/Camera485 Application Note.docx
+++ b/projects/Camera485/Camera485 Application Note.docx
@@ -32,6 +32,9 @@
         <w:jc w:val="center"/>
       </w:pPr>
       <w:r>
+        <w:rPr>
+          <w:noProof/>
+        </w:rPr>
         <w:drawing>
           <wp:inline distT="0" distB="0" distL="0" distR="0" wp14:anchorId="5EA9A03D" wp14:editId="2C751C0D">
             <wp:extent cx="1836807" cy="2219325"/>
@@ -69,6 +72,9 @@
         </w:drawing>
       </w:r>
       <w:r>
+        <w:rPr>
+          <w:noProof/>
+        </w:rPr>
         <w:drawing>
           <wp:inline distT="0" distB="0" distL="0" distR="0" wp14:anchorId="6375D0E7" wp14:editId="39DC1DDD">
             <wp:extent cx="2085975" cy="1484251"/>
@@ -173,6 +179,15 @@
         </w:rPr>
         <w:t>2</w:t>
       </w:r>
+      <w:r>
+        <w:rPr>
+          <w:b/>
+          <w:bCs/>
+          <w:sz w:val="28"/>
+          <w:szCs w:val="28"/>
+        </w:rPr>
+        <w:t>.1</w:t>
+      </w:r>
     </w:p>
     <w:p>
       <w:pPr>
@@ -502,6 +517,9 @@
         <w:jc w:val="center"/>
       </w:pPr>
       <w:r>
+        <w:rPr>
+          <w:noProof/>
+        </w:rPr>
         <w:drawing>
           <wp:inline distT="0" distB="0" distL="0" distR="0" wp14:anchorId="789FE6C7" wp14:editId="394E87D4">
             <wp:extent cx="5677786" cy="5319000"/>
@@ -878,6 +896,9 @@
         <w:ind w:left="720"/>
       </w:pPr>
       <w:r>
+        <w:rPr>
+          <w:noProof/>
+        </w:rPr>
         <w:drawing>
           <wp:inline distT="0" distB="0" distL="0" distR="0" wp14:anchorId="5E85FBCA" wp14:editId="45B8E3E9">
             <wp:extent cx="5263117" cy="5103628"/>
@@ -1384,7 +1405,13 @@
           </w:tcPr>
           <w:p>
             <w:r>
-              <w:t>where to store images for transmission, so for instance, if you prefer to configure your cell FTP with TX2, change this value to “/</w:t>
+              <w:t>where to store images for transmission, so for instance, if you prefer to configure your with TX</w:t>
+            </w:r>
+            <w:r>
+              <w:t>4</w:t>
+            </w:r>
+            <w:r>
+              <w:t>, change this value to “/</w:t>
             </w:r>
             <w:proofErr w:type="spellStart"/>
             <w:r>
@@ -1392,7 +1419,13 @@
             </w:r>
             <w:proofErr w:type="spellEnd"/>
             <w:r>
-              <w:t>/TX2”</w:t>
+              <w:t>/TX</w:t>
+            </w:r>
+            <w:r>
+              <w:t>4</w:t>
+            </w:r>
+            <w:r>
+              <w:t>”</w:t>
             </w:r>
           </w:p>
           <w:p>
@@ -3841,8 +3874,31 @@
         <w:ind w:left="720"/>
       </w:pPr>
       <w:r>
-        <w:t>You will need an FTP Server and the login credentials for the FTP server in order to proceed.</w:t>
-      </w:r>
+        <w:t xml:space="preserve">You will need an </w:t>
+      </w:r>
+      <w:r>
+        <w:t>destination</w:t>
+      </w:r>
+      <w:r>
+        <w:t xml:space="preserve"> </w:t>
+      </w:r>
+      <w:r>
+        <w:t>s</w:t>
+      </w:r>
+      <w:r>
+        <w:t xml:space="preserve">erver </w:t>
+      </w:r>
+      <w:r>
+        <w:t>that will receive the images</w:t>
+      </w:r>
+      <w:r>
+        <w:t>.</w:t>
+      </w:r>
+    </w:p>
+    <w:p>
+      <w:pPr>
+        <w:ind w:left="720"/>
+      </w:pPr>
     </w:p>
     <w:p>
       <w:pPr>
@@ -4990,6 +5046,9 @@
       <w:jc w:val="center"/>
     </w:pPr>
     <w:r>
+      <w:rPr>
+        <w:noProof/>
+      </w:rPr>
       <w:drawing>
         <wp:anchor distT="0" distB="0" distL="114300" distR="114300" simplePos="0" relativeHeight="251658240" behindDoc="1" locked="0" layoutInCell="1" allowOverlap="1" wp14:anchorId="504DCA6D" wp14:editId="73A299AF">
           <wp:simplePos x="0" y="0"/>

</xml_diff>